<commit_message>
atualização da aula dia 08/09/26
</commit_message>
<xml_diff>
--- a/apostila/Projeto Space for me3.docx
+++ b/apostila/Projeto Space for me3.docx
@@ -3543,6 +3543,9 @@
         </mc:AlternateContent>
       </w:r>
       <w:r>
+        <w:rPr>
+          <w:noProof/>
+        </w:rPr>
         <w:drawing>
           <wp:inline distT="0" distB="0" distL="0" distR="0" wp14:anchorId="6E770DDD" wp14:editId="2F5DE36E">
             <wp:extent cx="5193665" cy="2897731"/>
@@ -3731,6 +3734,9 @@
         </mc:AlternateContent>
       </w:r>
       <w:r>
+        <w:rPr>
+          <w:noProof/>
+        </w:rPr>
         <w:drawing>
           <wp:inline distT="0" distB="0" distL="0" distR="0" wp14:anchorId="6F447F1C" wp14:editId="671FB30E">
             <wp:extent cx="3638550" cy="1952625"/>
@@ -3768,6 +3774,9 @@
         </w:drawing>
       </w:r>
       <w:r>
+        <w:rPr>
+          <w:noProof/>
+        </w:rPr>
         <w:drawing>
           <wp:inline distT="0" distB="0" distL="0" distR="0" wp14:anchorId="7B73A903" wp14:editId="2FA6B944">
             <wp:extent cx="7562850" cy="1081297"/>
@@ -3891,6 +3900,9 @@
     </w:p>
     <w:p>
       <w:r>
+        <w:rPr>
+          <w:noProof/>
+        </w:rPr>
         <w:drawing>
           <wp:inline distT="0" distB="0" distL="0" distR="0" wp14:anchorId="764E3C23" wp14:editId="3265FBB5">
             <wp:extent cx="7421011" cy="3372321"/>
@@ -4010,6 +4022,9 @@
     </w:p>
     <w:p>
       <w:r>
+        <w:rPr>
+          <w:noProof/>
+        </w:rPr>
         <w:drawing>
           <wp:inline distT="0" distB="0" distL="0" distR="0" wp14:anchorId="31CA984A" wp14:editId="4441188A">
             <wp:extent cx="3781953" cy="1962424"/>
@@ -4055,6 +4070,9 @@
     </w:p>
     <w:p>
       <w:r>
+        <w:rPr>
+          <w:noProof/>
+        </w:rPr>
         <w:drawing>
           <wp:inline distT="0" distB="0" distL="0" distR="0" wp14:anchorId="255AF8C5" wp14:editId="1043AB85">
             <wp:extent cx="7099095" cy="1479906"/>
@@ -4174,6 +4192,9 @@
         </mc:AlternateContent>
       </w:r>
       <w:r>
+        <w:rPr>
+          <w:noProof/>
+        </w:rPr>
         <w:drawing>
           <wp:inline distT="0" distB="0" distL="0" distR="0" wp14:anchorId="4A2D2F6F" wp14:editId="42819635">
             <wp:extent cx="4715533" cy="1676634"/>
@@ -4213,6 +4234,9 @@
     </w:p>
     <w:p>
       <w:r>
+        <w:rPr>
+          <w:noProof/>
+        </w:rPr>
         <w:drawing>
           <wp:inline distT="0" distB="0" distL="0" distR="0" wp14:anchorId="30EEF7DE" wp14:editId="5AA7CFE5">
             <wp:extent cx="8262900" cy="1642194"/>
@@ -4250,10 +4274,2103 @@
         </w:drawing>
       </w:r>
     </w:p>
+    <w:p/>
+    <w:p>
+      <w:r>
+        <w:t>33-D</w:t>
+      </w:r>
+      <w:r>
+        <w:t>e</w:t>
+      </w:r>
+      <w:r>
+        <w:t xml:space="preserve">ntro do </w:t>
+      </w:r>
+      <w:proofErr w:type="spellStart"/>
+      <w:r>
+        <w:t>main</w:t>
+      </w:r>
+      <w:proofErr w:type="spellEnd"/>
+      <w:r>
+        <w:t xml:space="preserve"> criamos uma lista não ordenada que inserimos os itens com subtítulo, imagem e parágrafo:</w:t>
+      </w:r>
+    </w:p>
+    <w:p>
+      <w:r>
+        <w:rPr>
+          <w:noProof/>
+        </w:rPr>
+        <w:drawing>
+          <wp:inline distT="0" distB="0" distL="0" distR="0" wp14:anchorId="01E3BB71" wp14:editId="189A88C3">
+            <wp:extent cx="4772691" cy="4039164"/>
+            <wp:effectExtent l="0" t="0" r="8890" b="0"/>
+            <wp:docPr id="68" name="Imagem 68"/>
+            <wp:cNvGraphicFramePr>
+              <a:graphicFrameLocks xmlns:a="http://schemas.openxmlformats.org/drawingml/2006/main" noChangeAspect="1"/>
+            </wp:cNvGraphicFramePr>
+            <a:graphic xmlns:a="http://schemas.openxmlformats.org/drawingml/2006/main">
+              <a:graphicData uri="http://schemas.openxmlformats.org/drawingml/2006/picture">
+                <pic:pic xmlns:pic="http://schemas.openxmlformats.org/drawingml/2006/picture">
+                  <pic:nvPicPr>
+                    <pic:cNvPr id="1" name=""/>
+                    <pic:cNvPicPr/>
+                  </pic:nvPicPr>
+                  <pic:blipFill>
+                    <a:blip r:embed="rId64"/>
+                    <a:stretch>
+                      <a:fillRect/>
+                    </a:stretch>
+                  </pic:blipFill>
+                  <pic:spPr>
+                    <a:xfrm>
+                      <a:off x="0" y="0"/>
+                      <a:ext cx="4772691" cy="4039164"/>
+                    </a:xfrm>
+                    <a:prstGeom prst="rect">
+                      <a:avLst/>
+                    </a:prstGeom>
+                  </pic:spPr>
+                </pic:pic>
+              </a:graphicData>
+            </a:graphic>
+          </wp:inline>
+        </w:drawing>
+      </w:r>
+    </w:p>
+    <w:p>
+      <w:r>
+        <w:t xml:space="preserve">34- Para </w:t>
+      </w:r>
+      <w:r>
+        <w:t xml:space="preserve">colocar os itens da lista de produtos um ao lado do outro adicionamos um </w:t>
+      </w:r>
+      <w:proofErr w:type="spellStart"/>
+      <w:r>
+        <w:t>class</w:t>
+      </w:r>
+      <w:proofErr w:type="spellEnd"/>
+      <w:r>
+        <w:t xml:space="preserve"> no </w:t>
+      </w:r>
+      <w:proofErr w:type="spellStart"/>
+      <w:r>
+        <w:t>html</w:t>
+      </w:r>
+      <w:proofErr w:type="spellEnd"/>
+      <w:r>
+        <w:t xml:space="preserve"> chamada produtos e no </w:t>
+      </w:r>
+      <w:proofErr w:type="spellStart"/>
+      <w:r>
+        <w:t>css</w:t>
+      </w:r>
+      <w:proofErr w:type="spellEnd"/>
+      <w:r>
+        <w:t xml:space="preserve"> mudamos a natureza de lista para </w:t>
+      </w:r>
+      <w:proofErr w:type="spellStart"/>
+      <w:r>
+        <w:t>inline-block</w:t>
+      </w:r>
+      <w:proofErr w:type="spellEnd"/>
+      <w:r>
+        <w:t>.</w:t>
+      </w:r>
+    </w:p>
+    <w:p>
+      <w:r>
+        <w:rPr>
+          <w:noProof/>
+        </w:rPr>
+        <w:drawing>
+          <wp:inline distT="0" distB="0" distL="0" distR="0" wp14:anchorId="5ADAC479" wp14:editId="15B041A2">
+            <wp:extent cx="4734586" cy="3886742"/>
+            <wp:effectExtent l="0" t="0" r="8890" b="0"/>
+            <wp:docPr id="69" name="Imagem 69"/>
+            <wp:cNvGraphicFramePr>
+              <a:graphicFrameLocks xmlns:a="http://schemas.openxmlformats.org/drawingml/2006/main" noChangeAspect="1"/>
+            </wp:cNvGraphicFramePr>
+            <a:graphic xmlns:a="http://schemas.openxmlformats.org/drawingml/2006/main">
+              <a:graphicData uri="http://schemas.openxmlformats.org/drawingml/2006/picture">
+                <pic:pic xmlns:pic="http://schemas.openxmlformats.org/drawingml/2006/picture">
+                  <pic:nvPicPr>
+                    <pic:cNvPr id="1" name=""/>
+                    <pic:cNvPicPr/>
+                  </pic:nvPicPr>
+                  <pic:blipFill>
+                    <a:blip r:embed="rId65"/>
+                    <a:stretch>
+                      <a:fillRect/>
+                    </a:stretch>
+                  </pic:blipFill>
+                  <pic:spPr>
+                    <a:xfrm>
+                      <a:off x="0" y="0"/>
+                      <a:ext cx="4734586" cy="3886742"/>
+                    </a:xfrm>
+                    <a:prstGeom prst="rect">
+                      <a:avLst/>
+                    </a:prstGeom>
+                  </pic:spPr>
+                </pic:pic>
+              </a:graphicData>
+            </a:graphic>
+          </wp:inline>
+        </w:drawing>
+      </w:r>
+      <w:r>
+        <w:rPr>
+          <w:noProof/>
+        </w:rPr>
+        <w:drawing>
+          <wp:inline distT="0" distB="0" distL="0" distR="0" wp14:anchorId="1D730F73" wp14:editId="62248099">
+            <wp:extent cx="2276793" cy="724001"/>
+            <wp:effectExtent l="0" t="0" r="9525" b="0"/>
+            <wp:docPr id="70" name="Imagem 70"/>
+            <wp:cNvGraphicFramePr>
+              <a:graphicFrameLocks xmlns:a="http://schemas.openxmlformats.org/drawingml/2006/main" noChangeAspect="1"/>
+            </wp:cNvGraphicFramePr>
+            <a:graphic xmlns:a="http://schemas.openxmlformats.org/drawingml/2006/main">
+              <a:graphicData uri="http://schemas.openxmlformats.org/drawingml/2006/picture">
+                <pic:pic xmlns:pic="http://schemas.openxmlformats.org/drawingml/2006/picture">
+                  <pic:nvPicPr>
+                    <pic:cNvPr id="1" name=""/>
+                    <pic:cNvPicPr/>
+                  </pic:nvPicPr>
+                  <pic:blipFill>
+                    <a:blip r:embed="rId66"/>
+                    <a:stretch>
+                      <a:fillRect/>
+                    </a:stretch>
+                  </pic:blipFill>
+                  <pic:spPr>
+                    <a:xfrm>
+                      <a:off x="0" y="0"/>
+                      <a:ext cx="2276793" cy="724001"/>
+                    </a:xfrm>
+                    <a:prstGeom prst="rect">
+                      <a:avLst/>
+                    </a:prstGeom>
+                  </pic:spPr>
+                </pic:pic>
+              </a:graphicData>
+            </a:graphic>
+          </wp:inline>
+        </w:drawing>
+      </w:r>
+    </w:p>
+    <w:p>
+      <w:r>
+        <w:rPr>
+          <w:noProof/>
+        </w:rPr>
+        <w:drawing>
+          <wp:inline distT="0" distB="0" distL="0" distR="0" wp14:anchorId="263E4A20" wp14:editId="366C61E6">
+            <wp:extent cx="4570388" cy="1513205"/>
+            <wp:effectExtent l="0" t="0" r="1905" b="0"/>
+            <wp:docPr id="71" name="Imagem 71"/>
+            <wp:cNvGraphicFramePr>
+              <a:graphicFrameLocks xmlns:a="http://schemas.openxmlformats.org/drawingml/2006/main" noChangeAspect="1"/>
+            </wp:cNvGraphicFramePr>
+            <a:graphic xmlns:a="http://schemas.openxmlformats.org/drawingml/2006/main">
+              <a:graphicData uri="http://schemas.openxmlformats.org/drawingml/2006/picture">
+                <pic:pic xmlns:pic="http://schemas.openxmlformats.org/drawingml/2006/picture">
+                  <pic:nvPicPr>
+                    <pic:cNvPr id="1" name=""/>
+                    <pic:cNvPicPr/>
+                  </pic:nvPicPr>
+                  <pic:blipFill>
+                    <a:blip r:embed="rId67"/>
+                    <a:stretch>
+                      <a:fillRect/>
+                    </a:stretch>
+                  </pic:blipFill>
+                  <pic:spPr>
+                    <a:xfrm>
+                      <a:off x="0" y="0"/>
+                      <a:ext cx="4809218" cy="1592279"/>
+                    </a:xfrm>
+                    <a:prstGeom prst="rect">
+                      <a:avLst/>
+                    </a:prstGeom>
+                  </pic:spPr>
+                </pic:pic>
+              </a:graphicData>
+            </a:graphic>
+          </wp:inline>
+        </w:drawing>
+      </w:r>
+    </w:p>
+    <w:p>
+      <w:r>
+        <w:t xml:space="preserve">35-Para centralizar a nossa lista de produtos na </w:t>
+      </w:r>
+      <w:proofErr w:type="spellStart"/>
+      <w:r>
+        <w:t>class</w:t>
+      </w:r>
+      <w:proofErr w:type="spellEnd"/>
+      <w:r>
+        <w:t xml:space="preserve"> produtos, demos uma largura de 940px e utilizamos o </w:t>
+      </w:r>
+      <w:proofErr w:type="spellStart"/>
+      <w:r>
+        <w:t>margin</w:t>
+      </w:r>
+      <w:proofErr w:type="spellEnd"/>
+      <w:r>
+        <w:t>: 0 auto.</w:t>
+      </w:r>
+    </w:p>
+    <w:p>
+      <w:r>
+        <w:rPr>
+          <w:noProof/>
+        </w:rPr>
+        <mc:AlternateContent>
+          <mc:Choice Requires="wps">
+            <w:drawing>
+              <wp:anchor distT="0" distB="0" distL="114300" distR="114300" simplePos="0" relativeHeight="251673600" behindDoc="0" locked="0" layoutInCell="1" allowOverlap="1" wp14:anchorId="1B9F6857" wp14:editId="39C8307D">
+                <wp:simplePos x="0" y="0"/>
+                <wp:positionH relativeFrom="column">
+                  <wp:posOffset>2095500</wp:posOffset>
+                </wp:positionH>
+                <wp:positionV relativeFrom="paragraph">
+                  <wp:posOffset>616585</wp:posOffset>
+                </wp:positionV>
+                <wp:extent cx="676275" cy="285750"/>
+                <wp:effectExtent l="0" t="0" r="66675" b="57150"/>
+                <wp:wrapNone/>
+                <wp:docPr id="74" name="Conector de Seta Reta 74"/>
+                <wp:cNvGraphicFramePr/>
+                <a:graphic xmlns:a="http://schemas.openxmlformats.org/drawingml/2006/main">
+                  <a:graphicData uri="http://schemas.microsoft.com/office/word/2010/wordprocessingShape">
+                    <wps:wsp>
+                      <wps:cNvCnPr/>
+                      <wps:spPr>
+                        <a:xfrm>
+                          <a:off x="0" y="0"/>
+                          <a:ext cx="676275" cy="285750"/>
+                        </a:xfrm>
+                        <a:prstGeom prst="straightConnector1">
+                          <a:avLst/>
+                        </a:prstGeom>
+                        <a:ln>
+                          <a:tailEnd type="triangle"/>
+                        </a:ln>
+                      </wps:spPr>
+                      <wps:style>
+                        <a:lnRef idx="1">
+                          <a:schemeClr val="accent2"/>
+                        </a:lnRef>
+                        <a:fillRef idx="0">
+                          <a:schemeClr val="accent2"/>
+                        </a:fillRef>
+                        <a:effectRef idx="0">
+                          <a:schemeClr val="accent2"/>
+                        </a:effectRef>
+                        <a:fontRef idx="minor">
+                          <a:schemeClr val="tx1"/>
+                        </a:fontRef>
+                      </wps:style>
+                      <wps:bodyPr/>
+                    </wps:wsp>
+                  </a:graphicData>
+                </a:graphic>
+              </wp:anchor>
+            </w:drawing>
+          </mc:Choice>
+          <mc:Fallback>
+            <w:pict>
+              <v:shapetype w14:anchorId="59BA5142" id="_x0000_t32" coordsize="21600,21600" o:spt="32" o:oned="t" path="m,l21600,21600e" filled="f">
+                <v:path arrowok="t" fillok="f" o:connecttype="none"/>
+                <o:lock v:ext="edit" shapetype="t"/>
+              </v:shapetype>
+              <v:shape id="Conector de Seta Reta 74" o:spid="_x0000_s1026" type="#_x0000_t32" style="position:absolute;margin-left:165pt;margin-top:48.55pt;width:53.25pt;height:22.5pt;z-index:251673600;visibility:visible;mso-wrap-style:square;mso-wrap-distance-left:9pt;mso-wrap-distance-top:0;mso-wrap-distance-right:9pt;mso-wrap-distance-bottom:0;mso-position-horizontal:absolute;mso-position-horizontal-relative:text;mso-position-vertical:absolute;mso-position-vertical-relative:text" o:gfxdata="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" strokecolor="#ed7d31 [3205]" strokeweight=".5pt">
+                <v:stroke endarrow="block" joinstyle="miter"/>
+              </v:shape>
+            </w:pict>
+          </mc:Fallback>
+        </mc:AlternateContent>
+      </w:r>
+      <w:r>
+        <w:rPr>
+          <w:noProof/>
+        </w:rPr>
+        <w:drawing>
+          <wp:inline distT="0" distB="0" distL="0" distR="0" wp14:anchorId="4EE78A51" wp14:editId="23B21EBE">
+            <wp:extent cx="1914792" cy="771633"/>
+            <wp:effectExtent l="0" t="0" r="0" b="9525"/>
+            <wp:docPr id="72" name="Imagem 72"/>
+            <wp:cNvGraphicFramePr>
+              <a:graphicFrameLocks xmlns:a="http://schemas.openxmlformats.org/drawingml/2006/main" noChangeAspect="1"/>
+            </wp:cNvGraphicFramePr>
+            <a:graphic xmlns:a="http://schemas.openxmlformats.org/drawingml/2006/main">
+              <a:graphicData uri="http://schemas.openxmlformats.org/drawingml/2006/picture">
+                <pic:pic xmlns:pic="http://schemas.openxmlformats.org/drawingml/2006/picture">
+                  <pic:nvPicPr>
+                    <pic:cNvPr id="1" name=""/>
+                    <pic:cNvPicPr/>
+                  </pic:nvPicPr>
+                  <pic:blipFill>
+                    <a:blip r:embed="rId68"/>
+                    <a:stretch>
+                      <a:fillRect/>
+                    </a:stretch>
+                  </pic:blipFill>
+                  <pic:spPr>
+                    <a:xfrm>
+                      <a:off x="0" y="0"/>
+                      <a:ext cx="1914792" cy="771633"/>
+                    </a:xfrm>
+                    <a:prstGeom prst="rect">
+                      <a:avLst/>
+                    </a:prstGeom>
+                  </pic:spPr>
+                </pic:pic>
+              </a:graphicData>
+            </a:graphic>
+          </wp:inline>
+        </w:drawing>
+      </w:r>
+      <w:r>
+        <w:rPr>
+          <w:noProof/>
+        </w:rPr>
+        <w:drawing>
+          <wp:inline distT="0" distB="0" distL="0" distR="0" wp14:anchorId="315831F8" wp14:editId="737663F6">
+            <wp:extent cx="3409950" cy="1505576"/>
+            <wp:effectExtent l="0" t="0" r="0" b="0"/>
+            <wp:docPr id="73" name="Imagem 73"/>
+            <wp:cNvGraphicFramePr>
+              <a:graphicFrameLocks xmlns:a="http://schemas.openxmlformats.org/drawingml/2006/main" noChangeAspect="1"/>
+            </wp:cNvGraphicFramePr>
+            <a:graphic xmlns:a="http://schemas.openxmlformats.org/drawingml/2006/main">
+              <a:graphicData uri="http://schemas.openxmlformats.org/drawingml/2006/picture">
+                <pic:pic xmlns:pic="http://schemas.openxmlformats.org/drawingml/2006/picture">
+                  <pic:nvPicPr>
+                    <pic:cNvPr id="1" name=""/>
+                    <pic:cNvPicPr/>
+                  </pic:nvPicPr>
+                  <pic:blipFill>
+                    <a:blip r:embed="rId69"/>
+                    <a:stretch>
+                      <a:fillRect/>
+                    </a:stretch>
+                  </pic:blipFill>
+                  <pic:spPr>
+                    <a:xfrm rot="10800000" flipV="1">
+                      <a:off x="0" y="0"/>
+                      <a:ext cx="3583086" cy="1582020"/>
+                    </a:xfrm>
+                    <a:prstGeom prst="rect">
+                      <a:avLst/>
+                    </a:prstGeom>
+                  </pic:spPr>
+                </pic:pic>
+              </a:graphicData>
+            </a:graphic>
+          </wp:inline>
+        </w:drawing>
+      </w:r>
+    </w:p>
+    <w:p>
+      <w:r>
+        <w:t xml:space="preserve">Para centralizar o texto de cada item utilizamos o </w:t>
+      </w:r>
+      <w:proofErr w:type="spellStart"/>
+      <w:r>
+        <w:t>text-aling</w:t>
+      </w:r>
+      <w:proofErr w:type="spellEnd"/>
+      <w:r>
+        <w:t>: center nos produtos li.</w:t>
+      </w:r>
+    </w:p>
+    <w:p>
+      <w:r>
+        <w:rPr>
+          <w:noProof/>
+        </w:rPr>
+        <w:drawing>
+          <wp:inline distT="0" distB="0" distL="0" distR="0" wp14:anchorId="551A3EDA" wp14:editId="6AEA0DE1">
+            <wp:extent cx="1943371" cy="457264"/>
+            <wp:effectExtent l="0" t="0" r="0" b="0"/>
+            <wp:docPr id="75" name="Imagem 75"/>
+            <wp:cNvGraphicFramePr>
+              <a:graphicFrameLocks xmlns:a="http://schemas.openxmlformats.org/drawingml/2006/main" noChangeAspect="1"/>
+            </wp:cNvGraphicFramePr>
+            <a:graphic xmlns:a="http://schemas.openxmlformats.org/drawingml/2006/main">
+              <a:graphicData uri="http://schemas.openxmlformats.org/drawingml/2006/picture">
+                <pic:pic xmlns:pic="http://schemas.openxmlformats.org/drawingml/2006/picture">
+                  <pic:nvPicPr>
+                    <pic:cNvPr id="1" name=""/>
+                    <pic:cNvPicPr/>
+                  </pic:nvPicPr>
+                  <pic:blipFill>
+                    <a:blip r:embed="rId70"/>
+                    <a:stretch>
+                      <a:fillRect/>
+                    </a:stretch>
+                  </pic:blipFill>
+                  <pic:spPr>
+                    <a:xfrm>
+                      <a:off x="0" y="0"/>
+                      <a:ext cx="1943371" cy="457264"/>
+                    </a:xfrm>
+                    <a:prstGeom prst="rect">
+                      <a:avLst/>
+                    </a:prstGeom>
+                  </pic:spPr>
+                </pic:pic>
+              </a:graphicData>
+            </a:graphic>
+          </wp:inline>
+        </w:drawing>
+      </w:r>
+      <w:r>
+        <w:rPr>
+          <w:noProof/>
+        </w:rPr>
+        <w:drawing>
+          <wp:inline distT="0" distB="0" distL="0" distR="0" wp14:anchorId="6CBC29F3" wp14:editId="09A2466B">
+            <wp:extent cx="8630854" cy="2962688"/>
+            <wp:effectExtent l="0" t="0" r="0" b="9525"/>
+            <wp:docPr id="76" name="Imagem 76"/>
+            <wp:cNvGraphicFramePr>
+              <a:graphicFrameLocks xmlns:a="http://schemas.openxmlformats.org/drawingml/2006/main" noChangeAspect="1"/>
+            </wp:cNvGraphicFramePr>
+            <a:graphic xmlns:a="http://schemas.openxmlformats.org/drawingml/2006/main">
+              <a:graphicData uri="http://schemas.openxmlformats.org/drawingml/2006/picture">
+                <pic:pic xmlns:pic="http://schemas.openxmlformats.org/drawingml/2006/picture">
+                  <pic:nvPicPr>
+                    <pic:cNvPr id="1" name=""/>
+                    <pic:cNvPicPr/>
+                  </pic:nvPicPr>
+                  <pic:blipFill>
+                    <a:blip r:embed="rId71"/>
+                    <a:stretch>
+                      <a:fillRect/>
+                    </a:stretch>
+                  </pic:blipFill>
+                  <pic:spPr>
+                    <a:xfrm>
+                      <a:off x="0" y="0"/>
+                      <a:ext cx="8630854" cy="2962688"/>
+                    </a:xfrm>
+                    <a:prstGeom prst="rect">
+                      <a:avLst/>
+                    </a:prstGeom>
+                  </pic:spPr>
+                </pic:pic>
+              </a:graphicData>
+            </a:graphic>
+          </wp:inline>
+        </w:drawing>
+      </w:r>
+    </w:p>
+    <w:p>
+      <w:r>
+        <w:rPr>
+          <w:noProof/>
+        </w:rPr>
+        <mc:AlternateContent>
+          <mc:Choice Requires="wps">
+            <w:drawing>
+              <wp:anchor distT="0" distB="0" distL="114300" distR="114300" simplePos="0" relativeHeight="251674624" behindDoc="0" locked="0" layoutInCell="1" allowOverlap="1" wp14:anchorId="6FB7BF7E" wp14:editId="540287B2">
+                <wp:simplePos x="0" y="0"/>
+                <wp:positionH relativeFrom="column">
+                  <wp:posOffset>1104900</wp:posOffset>
+                </wp:positionH>
+                <wp:positionV relativeFrom="paragraph">
+                  <wp:posOffset>108585</wp:posOffset>
+                </wp:positionV>
+                <wp:extent cx="3638550" cy="762000"/>
+                <wp:effectExtent l="38100" t="0" r="19050" b="76200"/>
+                <wp:wrapNone/>
+                <wp:docPr id="78" name="Conector de Seta Reta 78"/>
+                <wp:cNvGraphicFramePr/>
+                <a:graphic xmlns:a="http://schemas.openxmlformats.org/drawingml/2006/main">
+                  <a:graphicData uri="http://schemas.microsoft.com/office/word/2010/wordprocessingShape">
+                    <wps:wsp>
+                      <wps:cNvCnPr/>
+                      <wps:spPr>
+                        <a:xfrm flipH="1">
+                          <a:off x="0" y="0"/>
+                          <a:ext cx="3638550" cy="762000"/>
+                        </a:xfrm>
+                        <a:prstGeom prst="straightConnector1">
+                          <a:avLst/>
+                        </a:prstGeom>
+                        <a:ln>
+                          <a:tailEnd type="triangle"/>
+                        </a:ln>
+                      </wps:spPr>
+                      <wps:style>
+                        <a:lnRef idx="1">
+                          <a:schemeClr val="accent2"/>
+                        </a:lnRef>
+                        <a:fillRef idx="0">
+                          <a:schemeClr val="accent2"/>
+                        </a:fillRef>
+                        <a:effectRef idx="0">
+                          <a:schemeClr val="accent2"/>
+                        </a:effectRef>
+                        <a:fontRef idx="minor">
+                          <a:schemeClr val="tx1"/>
+                        </a:fontRef>
+                      </wps:style>
+                      <wps:bodyPr/>
+                    </wps:wsp>
+                  </a:graphicData>
+                </a:graphic>
+              </wp:anchor>
+            </w:drawing>
+          </mc:Choice>
+          <mc:Fallback>
+            <w:pict>
+              <v:shape w14:anchorId="4F7870FB" id="Conector de Seta Reta 78" o:spid="_x0000_s1026" type="#_x0000_t32" style="position:absolute;margin-left:87pt;margin-top:8.55pt;width:286.5pt;height:60pt;flip:x;z-index:251674624;visibility:visible;mso-wrap-style:square;mso-wrap-distance-left:9pt;mso-wrap-distance-top:0;mso-wrap-distance-right:9pt;mso-wrap-distance-bottom:0;mso-position-horizontal:absolute;mso-position-horizontal-relative:text;mso-position-vertical:absolute;mso-position-vertical-relative:text" o:gfxdata="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" strokecolor="#ed7d31 [3205]" strokeweight=".5pt">
+                <v:stroke endarrow="block" joinstyle="miter"/>
+              </v:shape>
+            </w:pict>
+          </mc:Fallback>
+        </mc:AlternateContent>
+      </w:r>
+      <w:r>
+        <w:t>36-Determinamos que cada itens da lista ocupara 30% de largura e alinhamos o texto na parte superior.</w:t>
+      </w:r>
+    </w:p>
+    <w:p>
+      <w:r>
+        <w:rPr>
+          <w:noProof/>
+        </w:rPr>
+        <mc:AlternateContent>
+          <mc:Choice Requires="wps">
+            <w:drawing>
+              <wp:anchor distT="0" distB="0" distL="114300" distR="114300" simplePos="0" relativeHeight="251675648" behindDoc="0" locked="0" layoutInCell="1" allowOverlap="1" wp14:anchorId="03E4A171" wp14:editId="2D441F72">
+                <wp:simplePos x="0" y="0"/>
+                <wp:positionH relativeFrom="column">
+                  <wp:posOffset>1628775</wp:posOffset>
+                </wp:positionH>
+                <wp:positionV relativeFrom="paragraph">
+                  <wp:posOffset>222250</wp:posOffset>
+                </wp:positionV>
+                <wp:extent cx="3886200" cy="476250"/>
+                <wp:effectExtent l="38100" t="0" r="19050" b="76200"/>
+                <wp:wrapNone/>
+                <wp:docPr id="79" name="Conector de Seta Reta 79"/>
+                <wp:cNvGraphicFramePr/>
+                <a:graphic xmlns:a="http://schemas.openxmlformats.org/drawingml/2006/main">
+                  <a:graphicData uri="http://schemas.microsoft.com/office/word/2010/wordprocessingShape">
+                    <wps:wsp>
+                      <wps:cNvCnPr/>
+                      <wps:spPr>
+                        <a:xfrm flipH="1">
+                          <a:off x="0" y="0"/>
+                          <a:ext cx="3886200" cy="476250"/>
+                        </a:xfrm>
+                        <a:prstGeom prst="straightConnector1">
+                          <a:avLst/>
+                        </a:prstGeom>
+                        <a:ln>
+                          <a:tailEnd type="triangle"/>
+                        </a:ln>
+                      </wps:spPr>
+                      <wps:style>
+                        <a:lnRef idx="1">
+                          <a:schemeClr val="accent2"/>
+                        </a:lnRef>
+                        <a:fillRef idx="0">
+                          <a:schemeClr val="accent2"/>
+                        </a:fillRef>
+                        <a:effectRef idx="0">
+                          <a:schemeClr val="accent2"/>
+                        </a:effectRef>
+                        <a:fontRef idx="minor">
+                          <a:schemeClr val="tx1"/>
+                        </a:fontRef>
+                      </wps:style>
+                      <wps:bodyPr/>
+                    </wps:wsp>
+                  </a:graphicData>
+                </a:graphic>
+                <wp14:sizeRelH relativeFrom="margin">
+                  <wp14:pctWidth>0</wp14:pctWidth>
+                </wp14:sizeRelH>
+                <wp14:sizeRelV relativeFrom="margin">
+                  <wp14:pctHeight>0</wp14:pctHeight>
+                </wp14:sizeRelV>
+              </wp:anchor>
+            </w:drawing>
+          </mc:Choice>
+          <mc:Fallback>
+            <w:pict>
+              <v:shape w14:anchorId="02E241DC" id="Conector de Seta Reta 79" o:spid="_x0000_s1026" type="#_x0000_t32" style="position:absolute;margin-left:128.25pt;margin-top:17.5pt;width:306pt;height:37.5pt;flip:x;z-index:251675648;visibility:visible;mso-wrap-style:square;mso-width-percent:0;mso-height-percent:0;mso-wrap-distance-left:9pt;mso-wrap-distance-top:0;mso-wrap-distance-right:9pt;mso-wrap-distance-bottom:0;mso-position-horizontal:absolute;mso-position-horizontal-relative:text;mso-position-vertical:absolute;mso-position-vertical-relative:text;mso-width-percent:0;mso-height-percent:0;mso-width-relative:margin;mso-height-relative:margin" o:gfxdata="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" strokecolor="#ed7d31 [3205]" strokeweight=".5pt">
+                <v:stroke endarrow="block" joinstyle="miter"/>
+              </v:shape>
+            </w:pict>
+          </mc:Fallback>
+        </mc:AlternateContent>
+      </w:r>
+      <w:r>
+        <w:rPr>
+          <w:noProof/>
+        </w:rPr>
+        <w:drawing>
+          <wp:inline distT="0" distB="0" distL="0" distR="0" wp14:anchorId="77E4D03B" wp14:editId="20156B9C">
+            <wp:extent cx="2172003" cy="1228896"/>
+            <wp:effectExtent l="0" t="0" r="0" b="9525"/>
+            <wp:docPr id="77" name="Imagem 77"/>
+            <wp:cNvGraphicFramePr>
+              <a:graphicFrameLocks xmlns:a="http://schemas.openxmlformats.org/drawingml/2006/main" noChangeAspect="1"/>
+            </wp:cNvGraphicFramePr>
+            <a:graphic xmlns:a="http://schemas.openxmlformats.org/drawingml/2006/main">
+              <a:graphicData uri="http://schemas.openxmlformats.org/drawingml/2006/picture">
+                <pic:pic xmlns:pic="http://schemas.openxmlformats.org/drawingml/2006/picture">
+                  <pic:nvPicPr>
+                    <pic:cNvPr id="1" name=""/>
+                    <pic:cNvPicPr/>
+                  </pic:nvPicPr>
+                  <pic:blipFill>
+                    <a:blip r:embed="rId72"/>
+                    <a:stretch>
+                      <a:fillRect/>
+                    </a:stretch>
+                  </pic:blipFill>
+                  <pic:spPr>
+                    <a:xfrm>
+                      <a:off x="0" y="0"/>
+                      <a:ext cx="2172003" cy="1228896"/>
+                    </a:xfrm>
+                    <a:prstGeom prst="rect">
+                      <a:avLst/>
+                    </a:prstGeom>
+                  </pic:spPr>
+                </pic:pic>
+              </a:graphicData>
+            </a:graphic>
+          </wp:inline>
+        </w:drawing>
+      </w:r>
+    </w:p>
+    <w:p>
+      <w:r>
+        <w:t xml:space="preserve">37-Utilizamos o </w:t>
+      </w:r>
+      <w:proofErr w:type="spellStart"/>
+      <w:r>
+        <w:t>css</w:t>
+      </w:r>
+      <w:proofErr w:type="spellEnd"/>
+      <w:r>
+        <w:t xml:space="preserve"> através de </w:t>
+      </w:r>
+      <w:proofErr w:type="spellStart"/>
+      <w:r>
+        <w:t>referencia</w:t>
+      </w:r>
+      <w:proofErr w:type="spellEnd"/>
+      <w:r>
+        <w:t xml:space="preserve"> por exemplo utilizamos o nome da </w:t>
+      </w:r>
+      <w:proofErr w:type="spellStart"/>
+      <w:r>
+        <w:t>class</w:t>
+      </w:r>
+      <w:proofErr w:type="spellEnd"/>
+      <w:r>
+        <w:t xml:space="preserve"> e o elemento.</w:t>
+      </w:r>
+    </w:p>
+    <w:p>
+      <w:r>
+        <w:t>Aumentando o tamanho da fonte e deixando o texto mais encorpado.</w:t>
+      </w:r>
+    </w:p>
+    <w:p>
+      <w:r>
+        <w:rPr>
+          <w:noProof/>
+        </w:rPr>
+        <w:drawing>
+          <wp:inline distT="0" distB="0" distL="0" distR="0" wp14:anchorId="63A8E82E" wp14:editId="61E01A08">
+            <wp:extent cx="1695687" cy="685896"/>
+            <wp:effectExtent l="0" t="0" r="0" b="0"/>
+            <wp:docPr id="80" name="Imagem 80"/>
+            <wp:cNvGraphicFramePr>
+              <a:graphicFrameLocks xmlns:a="http://schemas.openxmlformats.org/drawingml/2006/main" noChangeAspect="1"/>
+            </wp:cNvGraphicFramePr>
+            <a:graphic xmlns:a="http://schemas.openxmlformats.org/drawingml/2006/main">
+              <a:graphicData uri="http://schemas.openxmlformats.org/drawingml/2006/picture">
+                <pic:pic xmlns:pic="http://schemas.openxmlformats.org/drawingml/2006/picture">
+                  <pic:nvPicPr>
+                    <pic:cNvPr id="1" name=""/>
+                    <pic:cNvPicPr/>
+                  </pic:nvPicPr>
+                  <pic:blipFill>
+                    <a:blip r:embed="rId73"/>
+                    <a:stretch>
+                      <a:fillRect/>
+                    </a:stretch>
+                  </pic:blipFill>
+                  <pic:spPr>
+                    <a:xfrm>
+                      <a:off x="0" y="0"/>
+                      <a:ext cx="1695687" cy="685896"/>
+                    </a:xfrm>
+                    <a:prstGeom prst="rect">
+                      <a:avLst/>
+                    </a:prstGeom>
+                  </pic:spPr>
+                </pic:pic>
+              </a:graphicData>
+            </a:graphic>
+          </wp:inline>
+        </w:drawing>
+      </w:r>
+    </w:p>
+    <w:p>
+      <w:r>
+        <w:t>38-</w:t>
+      </w:r>
+      <w:r>
+        <w:t xml:space="preserve">Nos parágrafos da lista dos produtos adicionamos as </w:t>
+      </w:r>
+      <w:proofErr w:type="spellStart"/>
+      <w:r>
+        <w:t>class</w:t>
+      </w:r>
+      <w:proofErr w:type="spellEnd"/>
+      <w:r>
+        <w:t xml:space="preserve"> </w:t>
+      </w:r>
+      <w:proofErr w:type="spellStart"/>
+      <w:r>
+        <w:t>descrcao</w:t>
+      </w:r>
+      <w:proofErr w:type="spellEnd"/>
+      <w:r>
+        <w:t xml:space="preserve"> e </w:t>
+      </w:r>
+      <w:proofErr w:type="spellStart"/>
+      <w:r>
+        <w:t>preco</w:t>
+      </w:r>
+      <w:proofErr w:type="spellEnd"/>
+      <w:r>
+        <w:t xml:space="preserve"> para trabalhar com esses dois elementos.</w:t>
+      </w:r>
+    </w:p>
+    <w:p>
+      <w:r>
+        <w:rPr>
+          <w:noProof/>
+        </w:rPr>
+        <w:drawing>
+          <wp:inline distT="0" distB="0" distL="0" distR="0" wp14:anchorId="17ED9558" wp14:editId="1086FE4E">
+            <wp:extent cx="3134162" cy="1428949"/>
+            <wp:effectExtent l="0" t="0" r="9525" b="0"/>
+            <wp:docPr id="81" name="Imagem 81"/>
+            <wp:cNvGraphicFramePr>
+              <a:graphicFrameLocks xmlns:a="http://schemas.openxmlformats.org/drawingml/2006/main" noChangeAspect="1"/>
+            </wp:cNvGraphicFramePr>
+            <a:graphic xmlns:a="http://schemas.openxmlformats.org/drawingml/2006/main">
+              <a:graphicData uri="http://schemas.openxmlformats.org/drawingml/2006/picture">
+                <pic:pic xmlns:pic="http://schemas.openxmlformats.org/drawingml/2006/picture">
+                  <pic:nvPicPr>
+                    <pic:cNvPr id="1" name=""/>
+                    <pic:cNvPicPr/>
+                  </pic:nvPicPr>
+                  <pic:blipFill>
+                    <a:blip r:embed="rId74"/>
+                    <a:stretch>
+                      <a:fillRect/>
+                    </a:stretch>
+                  </pic:blipFill>
+                  <pic:spPr>
+                    <a:xfrm>
+                      <a:off x="0" y="0"/>
+                      <a:ext cx="3134162" cy="1428949"/>
+                    </a:xfrm>
+                    <a:prstGeom prst="rect">
+                      <a:avLst/>
+                    </a:prstGeom>
+                  </pic:spPr>
+                </pic:pic>
+              </a:graphicData>
+            </a:graphic>
+          </wp:inline>
+        </w:drawing>
+      </w:r>
+    </w:p>
+    <w:p>
+      <w:r>
+        <w:t xml:space="preserve">39-Nos produtos li inserimos uma cor de fundo, demos uma </w:t>
+      </w:r>
+      <w:proofErr w:type="spellStart"/>
+      <w:r>
+        <w:t>distancia</w:t>
+      </w:r>
+      <w:proofErr w:type="spellEnd"/>
+      <w:r>
+        <w:t xml:space="preserve"> de 1,5% tanto para a direita quanto para a esquerda utilizando </w:t>
+      </w:r>
+      <w:proofErr w:type="spellStart"/>
+      <w:r>
+        <w:t>margin</w:t>
+      </w:r>
+      <w:proofErr w:type="spellEnd"/>
+      <w:r>
+        <w:t>:</w:t>
+      </w:r>
+    </w:p>
+    <w:p>
+      <w:pPr>
+        <w:rPr>
+          <w:noProof/>
+        </w:rPr>
+      </w:pPr>
+      <w:r>
+        <w:rPr>
+          <w:noProof/>
+        </w:rPr>
+        <mc:AlternateContent>
+          <mc:Choice Requires="wps">
+            <w:drawing>
+              <wp:anchor distT="0" distB="0" distL="114300" distR="114300" simplePos="0" relativeHeight="251677696" behindDoc="0" locked="0" layoutInCell="1" allowOverlap="1" wp14:anchorId="1174670A" wp14:editId="67627394">
+                <wp:simplePos x="0" y="0"/>
+                <wp:positionH relativeFrom="column">
+                  <wp:posOffset>1562100</wp:posOffset>
+                </wp:positionH>
+                <wp:positionV relativeFrom="paragraph">
+                  <wp:posOffset>1606549</wp:posOffset>
+                </wp:positionV>
+                <wp:extent cx="800100" cy="104775"/>
+                <wp:effectExtent l="38100" t="0" r="19050" b="85725"/>
+                <wp:wrapNone/>
+                <wp:docPr id="84" name="Conector de Seta Reta 84"/>
+                <wp:cNvGraphicFramePr/>
+                <a:graphic xmlns:a="http://schemas.openxmlformats.org/drawingml/2006/main">
+                  <a:graphicData uri="http://schemas.microsoft.com/office/word/2010/wordprocessingShape">
+                    <wps:wsp>
+                      <wps:cNvCnPr/>
+                      <wps:spPr>
+                        <a:xfrm flipH="1">
+                          <a:off x="0" y="0"/>
+                          <a:ext cx="800100" cy="104775"/>
+                        </a:xfrm>
+                        <a:prstGeom prst="straightConnector1">
+                          <a:avLst/>
+                        </a:prstGeom>
+                        <a:ln>
+                          <a:tailEnd type="triangle"/>
+                        </a:ln>
+                      </wps:spPr>
+                      <wps:style>
+                        <a:lnRef idx="1">
+                          <a:schemeClr val="accent1"/>
+                        </a:lnRef>
+                        <a:fillRef idx="0">
+                          <a:schemeClr val="accent1"/>
+                        </a:fillRef>
+                        <a:effectRef idx="0">
+                          <a:schemeClr val="accent1"/>
+                        </a:effectRef>
+                        <a:fontRef idx="minor">
+                          <a:schemeClr val="tx1"/>
+                        </a:fontRef>
+                      </wps:style>
+                      <wps:bodyPr/>
+                    </wps:wsp>
+                  </a:graphicData>
+                </a:graphic>
+                <wp14:sizeRelH relativeFrom="margin">
+                  <wp14:pctWidth>0</wp14:pctWidth>
+                </wp14:sizeRelH>
+                <wp14:sizeRelV relativeFrom="margin">
+                  <wp14:pctHeight>0</wp14:pctHeight>
+                </wp14:sizeRelV>
+              </wp:anchor>
+            </w:drawing>
+          </mc:Choice>
+          <mc:Fallback>
+            <w:pict>
+              <v:shape w14:anchorId="25F41A54" id="Conector de Seta Reta 84" o:spid="_x0000_s1026" type="#_x0000_t32" style="position:absolute;margin-left:123pt;margin-top:126.5pt;width:63pt;height:8.25pt;flip:x;z-index:251677696;visibility:visible;mso-wrap-style:square;mso-width-percent:0;mso-height-percent:0;mso-wrap-distance-left:9pt;mso-wrap-distance-top:0;mso-wrap-distance-right:9pt;mso-wrap-distance-bottom:0;mso-position-horizontal:absolute;mso-position-horizontal-relative:text;mso-position-vertical:absolute;mso-position-vertical-relative:text;mso-width-percent:0;mso-height-percent:0;mso-width-relative:margin;mso-height-relative:margin" o:gfxdata="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" strokecolor="#4472c4 [3204]" strokeweight=".5pt">
+                <v:stroke endarrow="block" joinstyle="miter"/>
+              </v:shape>
+            </w:pict>
+          </mc:Fallback>
+        </mc:AlternateContent>
+      </w:r>
+      <w:r>
+        <w:rPr>
+          <w:noProof/>
+        </w:rPr>
+        <mc:AlternateContent>
+          <mc:Choice Requires="wps">
+            <w:drawing>
+              <wp:anchor distT="0" distB="0" distL="114300" distR="114300" simplePos="0" relativeHeight="251676672" behindDoc="0" locked="0" layoutInCell="1" allowOverlap="1" wp14:anchorId="19BC305E" wp14:editId="32BA9C9F">
+                <wp:simplePos x="0" y="0"/>
+                <wp:positionH relativeFrom="column">
+                  <wp:posOffset>2000250</wp:posOffset>
+                </wp:positionH>
+                <wp:positionV relativeFrom="paragraph">
+                  <wp:posOffset>1311275</wp:posOffset>
+                </wp:positionV>
+                <wp:extent cx="857250" cy="238125"/>
+                <wp:effectExtent l="38100" t="0" r="19050" b="66675"/>
+                <wp:wrapNone/>
+                <wp:docPr id="83" name="Conector de Seta Reta 83"/>
+                <wp:cNvGraphicFramePr/>
+                <a:graphic xmlns:a="http://schemas.openxmlformats.org/drawingml/2006/main">
+                  <a:graphicData uri="http://schemas.microsoft.com/office/word/2010/wordprocessingShape">
+                    <wps:wsp>
+                      <wps:cNvCnPr/>
+                      <wps:spPr>
+                        <a:xfrm flipH="1">
+                          <a:off x="0" y="0"/>
+                          <a:ext cx="857250" cy="238125"/>
+                        </a:xfrm>
+                        <a:prstGeom prst="straightConnector1">
+                          <a:avLst/>
+                        </a:prstGeom>
+                        <a:ln>
+                          <a:tailEnd type="triangle"/>
+                        </a:ln>
+                      </wps:spPr>
+                      <wps:style>
+                        <a:lnRef idx="1">
+                          <a:schemeClr val="accent2"/>
+                        </a:lnRef>
+                        <a:fillRef idx="0">
+                          <a:schemeClr val="accent2"/>
+                        </a:fillRef>
+                        <a:effectRef idx="0">
+                          <a:schemeClr val="accent2"/>
+                        </a:effectRef>
+                        <a:fontRef idx="minor">
+                          <a:schemeClr val="tx1"/>
+                        </a:fontRef>
+                      </wps:style>
+                      <wps:bodyPr/>
+                    </wps:wsp>
+                  </a:graphicData>
+                </a:graphic>
+                <wp14:sizeRelH relativeFrom="margin">
+                  <wp14:pctWidth>0</wp14:pctWidth>
+                </wp14:sizeRelH>
+                <wp14:sizeRelV relativeFrom="margin">
+                  <wp14:pctHeight>0</wp14:pctHeight>
+                </wp14:sizeRelV>
+              </wp:anchor>
+            </w:drawing>
+          </mc:Choice>
+          <mc:Fallback>
+            <w:pict>
+              <v:shape w14:anchorId="6F883480" id="Conector de Seta Reta 83" o:spid="_x0000_s1026" type="#_x0000_t32" style="position:absolute;margin-left:157.5pt;margin-top:103.25pt;width:67.5pt;height:18.75pt;flip:x;z-index:251676672;visibility:visible;mso-wrap-style:square;mso-width-percent:0;mso-height-percent:0;mso-wrap-distance-left:9pt;mso-wrap-distance-top:0;mso-wrap-distance-right:9pt;mso-wrap-distance-bottom:0;mso-position-horizontal:absolute;mso-position-horizontal-relative:text;mso-position-vertical:absolute;mso-position-vertical-relative:text;mso-width-percent:0;mso-height-percent:0;mso-width-relative:margin;mso-height-relative:margin" o:gfxdata="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" strokecolor="#ed7d31 [3205]" strokeweight=".5pt">
+                <v:stroke endarrow="block" joinstyle="miter"/>
+              </v:shape>
+            </w:pict>
+          </mc:Fallback>
+        </mc:AlternateContent>
+      </w:r>
+      <w:r>
+        <w:rPr>
+          <w:noProof/>
+        </w:rPr>
+        <w:drawing>
+          <wp:inline distT="0" distB="0" distL="0" distR="0" wp14:anchorId="54C44A20" wp14:editId="15648273">
+            <wp:extent cx="2133898" cy="1409897"/>
+            <wp:effectExtent l="0" t="0" r="0" b="0"/>
+            <wp:docPr id="82" name="Imagem 82"/>
+            <wp:cNvGraphicFramePr>
+              <a:graphicFrameLocks xmlns:a="http://schemas.openxmlformats.org/drawingml/2006/main" noChangeAspect="1"/>
+            </wp:cNvGraphicFramePr>
+            <a:graphic xmlns:a="http://schemas.openxmlformats.org/drawingml/2006/main">
+              <a:graphicData uri="http://schemas.openxmlformats.org/drawingml/2006/picture">
+                <pic:pic xmlns:pic="http://schemas.openxmlformats.org/drawingml/2006/picture">
+                  <pic:nvPicPr>
+                    <pic:cNvPr id="1" name=""/>
+                    <pic:cNvPicPr/>
+                  </pic:nvPicPr>
+                  <pic:blipFill>
+                    <a:blip r:embed="rId75"/>
+                    <a:stretch>
+                      <a:fillRect/>
+                    </a:stretch>
+                  </pic:blipFill>
+                  <pic:spPr>
+                    <a:xfrm>
+                      <a:off x="0" y="0"/>
+                      <a:ext cx="2133898" cy="1409897"/>
+                    </a:xfrm>
+                    <a:prstGeom prst="rect">
+                      <a:avLst/>
+                    </a:prstGeom>
+                  </pic:spPr>
+                </pic:pic>
+              </a:graphicData>
+            </a:graphic>
+          </wp:inline>
+        </w:drawing>
+      </w:r>
+      <w:r>
+        <w:rPr>
+          <w:noProof/>
+        </w:rPr>
+        <w:t xml:space="preserve"> </w:t>
+      </w:r>
+      <w:r>
+        <w:rPr>
+          <w:noProof/>
+        </w:rPr>
+        <w:drawing>
+          <wp:inline distT="0" distB="0" distL="0" distR="0" wp14:anchorId="0E6027F4" wp14:editId="19E96DEC">
+            <wp:extent cx="7377708" cy="1943100"/>
+            <wp:effectExtent l="0" t="0" r="0" b="0"/>
+            <wp:docPr id="85" name="Imagem 85"/>
+            <wp:cNvGraphicFramePr>
+              <a:graphicFrameLocks xmlns:a="http://schemas.openxmlformats.org/drawingml/2006/main" noChangeAspect="1"/>
+            </wp:cNvGraphicFramePr>
+            <a:graphic xmlns:a="http://schemas.openxmlformats.org/drawingml/2006/main">
+              <a:graphicData uri="http://schemas.openxmlformats.org/drawingml/2006/picture">
+                <pic:pic xmlns:pic="http://schemas.openxmlformats.org/drawingml/2006/picture">
+                  <pic:nvPicPr>
+                    <pic:cNvPr id="1" name=""/>
+                    <pic:cNvPicPr/>
+                  </pic:nvPicPr>
+                  <pic:blipFill>
+                    <a:blip r:embed="rId76"/>
+                    <a:stretch>
+                      <a:fillRect/>
+                    </a:stretch>
+                  </pic:blipFill>
+                  <pic:spPr>
+                    <a:xfrm>
+                      <a:off x="0" y="0"/>
+                      <a:ext cx="7390681" cy="1946517"/>
+                    </a:xfrm>
+                    <a:prstGeom prst="rect">
+                      <a:avLst/>
+                    </a:prstGeom>
+                  </pic:spPr>
+                </pic:pic>
+              </a:graphicData>
+            </a:graphic>
+          </wp:inline>
+        </w:drawing>
+      </w:r>
+      <w:r>
+        <w:rPr>
+          <w:noProof/>
+        </w:rPr>
+        <w:t xml:space="preserve">      </w:t>
+      </w:r>
+    </w:p>
+    <w:p>
+      <w:pPr>
+        <w:rPr>
+          <w:noProof/>
+        </w:rPr>
+      </w:pPr>
+      <w:r>
+        <w:rPr>
+          <w:noProof/>
+        </w:rPr>
+        <w:t>40- na class produtos inserimos um espaço interno que aumentou o tamanho tanto para cima como para baixo.</w:t>
+      </w:r>
+    </w:p>
+    <w:p>
+      <w:r>
+        <w:rPr>
+          <w:noProof/>
+        </w:rPr>
+        <mc:AlternateContent>
+          <mc:Choice Requires="wps">
+            <w:drawing>
+              <wp:anchor distT="0" distB="0" distL="114300" distR="114300" simplePos="0" relativeHeight="251678720" behindDoc="0" locked="0" layoutInCell="1" allowOverlap="1" wp14:anchorId="2C5C4455" wp14:editId="35460F43">
+                <wp:simplePos x="0" y="0"/>
+                <wp:positionH relativeFrom="column">
+                  <wp:posOffset>2619375</wp:posOffset>
+                </wp:positionH>
+                <wp:positionV relativeFrom="paragraph">
+                  <wp:posOffset>933450</wp:posOffset>
+                </wp:positionV>
+                <wp:extent cx="571500" cy="419100"/>
+                <wp:effectExtent l="38100" t="0" r="19050" b="57150"/>
+                <wp:wrapNone/>
+                <wp:docPr id="88" name="Conector de Seta Reta 88"/>
+                <wp:cNvGraphicFramePr/>
+                <a:graphic xmlns:a="http://schemas.openxmlformats.org/drawingml/2006/main">
+                  <a:graphicData uri="http://schemas.microsoft.com/office/word/2010/wordprocessingShape">
+                    <wps:wsp>
+                      <wps:cNvCnPr/>
+                      <wps:spPr>
+                        <a:xfrm flipH="1">
+                          <a:off x="0" y="0"/>
+                          <a:ext cx="571500" cy="419100"/>
+                        </a:xfrm>
+                        <a:prstGeom prst="straightConnector1">
+                          <a:avLst/>
+                        </a:prstGeom>
+                        <a:ln>
+                          <a:tailEnd type="triangle"/>
+                        </a:ln>
+                      </wps:spPr>
+                      <wps:style>
+                        <a:lnRef idx="1">
+                          <a:schemeClr val="accent1"/>
+                        </a:lnRef>
+                        <a:fillRef idx="0">
+                          <a:schemeClr val="accent1"/>
+                        </a:fillRef>
+                        <a:effectRef idx="0">
+                          <a:schemeClr val="accent1"/>
+                        </a:effectRef>
+                        <a:fontRef idx="minor">
+                          <a:schemeClr val="tx1"/>
+                        </a:fontRef>
+                      </wps:style>
+                      <wps:bodyPr/>
+                    </wps:wsp>
+                  </a:graphicData>
+                </a:graphic>
+                <wp14:sizeRelH relativeFrom="margin">
+                  <wp14:pctWidth>0</wp14:pctWidth>
+                </wp14:sizeRelH>
+                <wp14:sizeRelV relativeFrom="margin">
+                  <wp14:pctHeight>0</wp14:pctHeight>
+                </wp14:sizeRelV>
+              </wp:anchor>
+            </w:drawing>
+          </mc:Choice>
+          <mc:Fallback>
+            <w:pict>
+              <v:shapetype w14:anchorId="0A225266" id="_x0000_t32" coordsize="21600,21600" o:spt="32" o:oned="t" path="m,l21600,21600e" filled="f">
+                <v:path arrowok="t" fillok="f" o:connecttype="none"/>
+                <o:lock v:ext="edit" shapetype="t"/>
+              </v:shapetype>
+              <v:shape id="Conector de Seta Reta 88" o:spid="_x0000_s1026" type="#_x0000_t32" style="position:absolute;margin-left:206.25pt;margin-top:73.5pt;width:45pt;height:33pt;flip:x;z-index:251678720;visibility:visible;mso-wrap-style:square;mso-width-percent:0;mso-height-percent:0;mso-wrap-distance-left:9pt;mso-wrap-distance-top:0;mso-wrap-distance-right:9pt;mso-wrap-distance-bottom:0;mso-position-horizontal:absolute;mso-position-horizontal-relative:text;mso-position-vertical:absolute;mso-position-vertical-relative:text;mso-width-percent:0;mso-height-percent:0;mso-width-relative:margin;mso-height-relative:margin" o:gfxdata="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" strokecolor="#4472c4 [3204]" strokeweight=".5pt">
+                <v:stroke endarrow="block" joinstyle="miter"/>
+              </v:shape>
+            </w:pict>
+          </mc:Fallback>
+        </mc:AlternateContent>
+      </w:r>
+      <w:r>
+        <w:rPr>
+          <w:noProof/>
+        </w:rPr>
+        <w:drawing>
+          <wp:inline distT="0" distB="0" distL="0" distR="0" wp14:anchorId="5C66AECF" wp14:editId="23AE93F2">
+            <wp:extent cx="2748266" cy="1819275"/>
+            <wp:effectExtent l="0" t="0" r="0" b="0"/>
+            <wp:docPr id="86" name="Imagem 86"/>
+            <wp:cNvGraphicFramePr>
+              <a:graphicFrameLocks xmlns:a="http://schemas.openxmlformats.org/drawingml/2006/main" noChangeAspect="1"/>
+            </wp:cNvGraphicFramePr>
+            <a:graphic xmlns:a="http://schemas.openxmlformats.org/drawingml/2006/main">
+              <a:graphicData uri="http://schemas.openxmlformats.org/drawingml/2006/picture">
+                <pic:pic xmlns:pic="http://schemas.openxmlformats.org/drawingml/2006/picture">
+                  <pic:nvPicPr>
+                    <pic:cNvPr id="1" name=""/>
+                    <pic:cNvPicPr/>
+                  </pic:nvPicPr>
+                  <pic:blipFill>
+                    <a:blip r:embed="rId77"/>
+                    <a:stretch>
+                      <a:fillRect/>
+                    </a:stretch>
+                  </pic:blipFill>
+                  <pic:spPr>
+                    <a:xfrm>
+                      <a:off x="0" y="0"/>
+                      <a:ext cx="2760745" cy="1827536"/>
+                    </a:xfrm>
+                    <a:prstGeom prst="rect">
+                      <a:avLst/>
+                    </a:prstGeom>
+                  </pic:spPr>
+                </pic:pic>
+              </a:graphicData>
+            </a:graphic>
+          </wp:inline>
+        </w:drawing>
+      </w:r>
+      <w:r>
+        <w:rPr>
+          <w:noProof/>
+        </w:rPr>
+        <w:drawing>
+          <wp:inline distT="0" distB="0" distL="0" distR="0" wp14:anchorId="2CC963F3" wp14:editId="61F8B75E">
+            <wp:extent cx="4637159" cy="2171700"/>
+            <wp:effectExtent l="0" t="0" r="0" b="0"/>
+            <wp:docPr id="87" name="Imagem 87"/>
+            <wp:cNvGraphicFramePr>
+              <a:graphicFrameLocks xmlns:a="http://schemas.openxmlformats.org/drawingml/2006/main" noChangeAspect="1"/>
+            </wp:cNvGraphicFramePr>
+            <a:graphic xmlns:a="http://schemas.openxmlformats.org/drawingml/2006/main">
+              <a:graphicData uri="http://schemas.openxmlformats.org/drawingml/2006/picture">
+                <pic:pic xmlns:pic="http://schemas.openxmlformats.org/drawingml/2006/picture">
+                  <pic:nvPicPr>
+                    <pic:cNvPr id="1" name=""/>
+                    <pic:cNvPicPr/>
+                  </pic:nvPicPr>
+                  <pic:blipFill>
+                    <a:blip r:embed="rId78"/>
+                    <a:stretch>
+                      <a:fillRect/>
+                    </a:stretch>
+                  </pic:blipFill>
+                  <pic:spPr>
+                    <a:xfrm rot="10800000" flipV="1">
+                      <a:off x="0" y="0"/>
+                      <a:ext cx="4778547" cy="2237916"/>
+                    </a:xfrm>
+                    <a:prstGeom prst="rect">
+                      <a:avLst/>
+                    </a:prstGeom>
+                  </pic:spPr>
+                </pic:pic>
+              </a:graphicData>
+            </a:graphic>
+          </wp:inline>
+        </w:drawing>
+      </w:r>
+    </w:p>
+    <w:p>
+      <w:r>
+        <w:t xml:space="preserve">41- </w:t>
+      </w:r>
+      <w:r>
+        <w:t>No produto li adicionamos um espaço interno para cima como para baixo e para direita e esquerda.</w:t>
+      </w:r>
+    </w:p>
+    <w:p>
+      <w:r>
+        <w:drawing>
+          <wp:inline distT="0" distB="0" distL="0" distR="0" wp14:anchorId="4AB1D17B" wp14:editId="53F34633">
+            <wp:extent cx="3818534" cy="1657350"/>
+            <wp:effectExtent l="0" t="0" r="0" b="0"/>
+            <wp:docPr id="91" name="Imagem 91"/>
+            <wp:cNvGraphicFramePr>
+              <a:graphicFrameLocks xmlns:a="http://schemas.openxmlformats.org/drawingml/2006/main" noChangeAspect="1"/>
+            </wp:cNvGraphicFramePr>
+            <a:graphic xmlns:a="http://schemas.openxmlformats.org/drawingml/2006/main">
+              <a:graphicData uri="http://schemas.openxmlformats.org/drawingml/2006/picture">
+                <pic:pic xmlns:pic="http://schemas.openxmlformats.org/drawingml/2006/picture">
+                  <pic:nvPicPr>
+                    <pic:cNvPr id="1" name=""/>
+                    <pic:cNvPicPr/>
+                  </pic:nvPicPr>
+                  <pic:blipFill>
+                    <a:blip r:embed="rId79"/>
+                    <a:stretch>
+                      <a:fillRect/>
+                    </a:stretch>
+                  </pic:blipFill>
+                  <pic:spPr>
+                    <a:xfrm>
+                      <a:off x="0" y="0"/>
+                      <a:ext cx="3825293" cy="1660284"/>
+                    </a:xfrm>
+                    <a:prstGeom prst="rect">
+                      <a:avLst/>
+                    </a:prstGeom>
+                  </pic:spPr>
+                </pic:pic>
+              </a:graphicData>
+            </a:graphic>
+          </wp:inline>
+        </w:drawing>
+      </w:r>
+      <w:r>
+        <w:drawing>
+          <wp:inline distT="0" distB="0" distL="0" distR="0" wp14:anchorId="3D07E6A1" wp14:editId="11B985AD">
+            <wp:extent cx="4598035" cy="2332144"/>
+            <wp:effectExtent l="0" t="0" r="0" b="0"/>
+            <wp:docPr id="90" name="Imagem 90"/>
+            <wp:cNvGraphicFramePr>
+              <a:graphicFrameLocks xmlns:a="http://schemas.openxmlformats.org/drawingml/2006/main" noChangeAspect="1"/>
+            </wp:cNvGraphicFramePr>
+            <a:graphic xmlns:a="http://schemas.openxmlformats.org/drawingml/2006/main">
+              <a:graphicData uri="http://schemas.openxmlformats.org/drawingml/2006/picture">
+                <pic:pic xmlns:pic="http://schemas.openxmlformats.org/drawingml/2006/picture">
+                  <pic:nvPicPr>
+                    <pic:cNvPr id="1" name=""/>
+                    <pic:cNvPicPr/>
+                  </pic:nvPicPr>
+                  <pic:blipFill>
+                    <a:blip r:embed="rId80"/>
+                    <a:stretch>
+                      <a:fillRect/>
+                    </a:stretch>
+                  </pic:blipFill>
+                  <pic:spPr>
+                    <a:xfrm>
+                      <a:off x="0" y="0"/>
+                      <a:ext cx="4624321" cy="2345476"/>
+                    </a:xfrm>
+                    <a:prstGeom prst="rect">
+                      <a:avLst/>
+                    </a:prstGeom>
+                  </pic:spPr>
+                </pic:pic>
+              </a:graphicData>
+            </a:graphic>
+          </wp:inline>
+        </w:drawing>
+      </w:r>
+    </w:p>
+    <w:p>
+      <w:r>
+        <w:t>42 – Para ajustar o espaço utilizamos o box-</w:t>
+      </w:r>
+      <w:proofErr w:type="spellStart"/>
+      <w:r>
+        <w:t>sizing</w:t>
+      </w:r>
+      <w:proofErr w:type="spellEnd"/>
+      <w:r>
+        <w:t xml:space="preserve"> onde ele automaticamente ajustou o espaço.</w:t>
+      </w:r>
+    </w:p>
+    <w:p>
+      <w:r>
+        <w:rPr>
+          <w:noProof/>
+        </w:rPr>
+        <mc:AlternateContent>
+          <mc:Choice Requires="wps">
+            <w:drawing>
+              <wp:anchor distT="0" distB="0" distL="114300" distR="114300" simplePos="0" relativeHeight="251679744" behindDoc="0" locked="0" layoutInCell="1" allowOverlap="1" wp14:anchorId="1CBA3436" wp14:editId="336A7F41">
+                <wp:simplePos x="0" y="0"/>
+                <wp:positionH relativeFrom="column">
+                  <wp:posOffset>2695575</wp:posOffset>
+                </wp:positionH>
+                <wp:positionV relativeFrom="paragraph">
+                  <wp:posOffset>2465070</wp:posOffset>
+                </wp:positionV>
+                <wp:extent cx="1276350" cy="47625"/>
+                <wp:effectExtent l="38100" t="38100" r="19050" b="85725"/>
+                <wp:wrapNone/>
+                <wp:docPr id="94" name="Conector de Seta Reta 94"/>
+                <wp:cNvGraphicFramePr/>
+                <a:graphic xmlns:a="http://schemas.openxmlformats.org/drawingml/2006/main">
+                  <a:graphicData uri="http://schemas.microsoft.com/office/word/2010/wordprocessingShape">
+                    <wps:wsp>
+                      <wps:cNvCnPr/>
+                      <wps:spPr>
+                        <a:xfrm flipH="1">
+                          <a:off x="0" y="0"/>
+                          <a:ext cx="1276350" cy="47625"/>
+                        </a:xfrm>
+                        <a:prstGeom prst="straightConnector1">
+                          <a:avLst/>
+                        </a:prstGeom>
+                        <a:ln>
+                          <a:tailEnd type="triangle"/>
+                        </a:ln>
+                      </wps:spPr>
+                      <wps:style>
+                        <a:lnRef idx="1">
+                          <a:schemeClr val="accent2"/>
+                        </a:lnRef>
+                        <a:fillRef idx="0">
+                          <a:schemeClr val="accent2"/>
+                        </a:fillRef>
+                        <a:effectRef idx="0">
+                          <a:schemeClr val="accent2"/>
+                        </a:effectRef>
+                        <a:fontRef idx="minor">
+                          <a:schemeClr val="tx1"/>
+                        </a:fontRef>
+                      </wps:style>
+                      <wps:bodyPr/>
+                    </wps:wsp>
+                  </a:graphicData>
+                </a:graphic>
+              </wp:anchor>
+            </w:drawing>
+          </mc:Choice>
+          <mc:Fallback>
+            <w:pict>
+              <v:shape w14:anchorId="6900FCEF" id="Conector de Seta Reta 94" o:spid="_x0000_s1026" type="#_x0000_t32" style="position:absolute;margin-left:212.25pt;margin-top:194.1pt;width:100.5pt;height:3.75pt;flip:x;z-index:251679744;visibility:visible;mso-wrap-style:square;mso-wrap-distance-left:9pt;mso-wrap-distance-top:0;mso-wrap-distance-right:9pt;mso-wrap-distance-bottom:0;mso-position-horizontal:absolute;mso-position-horizontal-relative:text;mso-position-vertical:absolute;mso-position-vertical-relative:text" o:gfxdata="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" strokecolor="#ed7d31 [3205]" strokeweight=".5pt">
+                <v:stroke endarrow="block" joinstyle="miter"/>
+              </v:shape>
+            </w:pict>
+          </mc:Fallback>
+        </mc:AlternateContent>
+      </w:r>
+      <w:r>
+        <w:drawing>
+          <wp:inline distT="0" distB="0" distL="0" distR="0" wp14:anchorId="12C86BBC" wp14:editId="41943813">
+            <wp:extent cx="3920924" cy="2286000"/>
+            <wp:effectExtent l="0" t="0" r="3810" b="0"/>
+            <wp:docPr id="92" name="Imagem 92"/>
+            <wp:cNvGraphicFramePr>
+              <a:graphicFrameLocks xmlns:a="http://schemas.openxmlformats.org/drawingml/2006/main" noChangeAspect="1"/>
+            </wp:cNvGraphicFramePr>
+            <a:graphic xmlns:a="http://schemas.openxmlformats.org/drawingml/2006/main">
+              <a:graphicData uri="http://schemas.openxmlformats.org/drawingml/2006/picture">
+                <pic:pic xmlns:pic="http://schemas.openxmlformats.org/drawingml/2006/picture">
+                  <pic:nvPicPr>
+                    <pic:cNvPr id="1" name=""/>
+                    <pic:cNvPicPr/>
+                  </pic:nvPicPr>
+                  <pic:blipFill>
+                    <a:blip r:embed="rId81"/>
+                    <a:stretch>
+                      <a:fillRect/>
+                    </a:stretch>
+                  </pic:blipFill>
+                  <pic:spPr>
+                    <a:xfrm>
+                      <a:off x="0" y="0"/>
+                      <a:ext cx="3932348" cy="2292661"/>
+                    </a:xfrm>
+                    <a:prstGeom prst="rect">
+                      <a:avLst/>
+                    </a:prstGeom>
+                  </pic:spPr>
+                </pic:pic>
+              </a:graphicData>
+            </a:graphic>
+          </wp:inline>
+        </w:drawing>
+      </w:r>
+      <w:r>
+        <w:drawing>
+          <wp:inline distT="0" distB="0" distL="0" distR="0" wp14:anchorId="11E72C90" wp14:editId="0632CB74">
+            <wp:extent cx="6553200" cy="2828925"/>
+            <wp:effectExtent l="0" t="0" r="0" b="9525"/>
+            <wp:docPr id="93" name="Imagem 93"/>
+            <wp:cNvGraphicFramePr>
+              <a:graphicFrameLocks xmlns:a="http://schemas.openxmlformats.org/drawingml/2006/main" noChangeAspect="1"/>
+            </wp:cNvGraphicFramePr>
+            <a:graphic xmlns:a="http://schemas.openxmlformats.org/drawingml/2006/main">
+              <a:graphicData uri="http://schemas.openxmlformats.org/drawingml/2006/picture">
+                <pic:pic xmlns:pic="http://schemas.openxmlformats.org/drawingml/2006/picture">
+                  <pic:nvPicPr>
+                    <pic:cNvPr id="1" name=""/>
+                    <pic:cNvPicPr/>
+                  </pic:nvPicPr>
+                  <pic:blipFill>
+                    <a:blip r:embed="rId82"/>
+                    <a:stretch>
+                      <a:fillRect/>
+                    </a:stretch>
+                  </pic:blipFill>
+                  <pic:spPr>
+                    <a:xfrm>
+                      <a:off x="0" y="0"/>
+                      <a:ext cx="6609051" cy="2853035"/>
+                    </a:xfrm>
+                    <a:prstGeom prst="rect">
+                      <a:avLst/>
+                    </a:prstGeom>
+                  </pic:spPr>
+                </pic:pic>
+              </a:graphicData>
+            </a:graphic>
+          </wp:inline>
+        </w:drawing>
+      </w:r>
+    </w:p>
+    <w:p>
+      <w:r>
+        <w:t xml:space="preserve">43- Para arrumar o espaço entre o texto e o preço colocamos um espaço externo na </w:t>
+      </w:r>
+      <w:proofErr w:type="spellStart"/>
+      <w:r>
+        <w:t>class</w:t>
+      </w:r>
+      <w:proofErr w:type="spellEnd"/>
+      <w:r>
+        <w:t xml:space="preserve"> </w:t>
+      </w:r>
+      <w:proofErr w:type="spellStart"/>
+      <w:r>
+        <w:t>preco</w:t>
+      </w:r>
+      <w:proofErr w:type="spellEnd"/>
+      <w:r>
+        <w:t xml:space="preserve"> conforme imagem.</w:t>
+      </w:r>
+    </w:p>
+    <w:p>
+      <w:r>
+        <w:rPr>
+          <w:noProof/>
+        </w:rPr>
+        <mc:AlternateContent>
+          <mc:Choice Requires="wps">
+            <w:drawing>
+              <wp:anchor distT="0" distB="0" distL="114300" distR="114300" simplePos="0" relativeHeight="251680768" behindDoc="0" locked="0" layoutInCell="1" allowOverlap="1" wp14:anchorId="5A1827F3" wp14:editId="461B4D8F">
+                <wp:simplePos x="0" y="0"/>
+                <wp:positionH relativeFrom="column">
+                  <wp:posOffset>2257425</wp:posOffset>
+                </wp:positionH>
+                <wp:positionV relativeFrom="paragraph">
+                  <wp:posOffset>567690</wp:posOffset>
+                </wp:positionV>
+                <wp:extent cx="1647825" cy="76200"/>
+                <wp:effectExtent l="38100" t="0" r="28575" b="95250"/>
+                <wp:wrapNone/>
+                <wp:docPr id="96" name="Conector de Seta Reta 96"/>
+                <wp:cNvGraphicFramePr/>
+                <a:graphic xmlns:a="http://schemas.openxmlformats.org/drawingml/2006/main">
+                  <a:graphicData uri="http://schemas.microsoft.com/office/word/2010/wordprocessingShape">
+                    <wps:wsp>
+                      <wps:cNvCnPr/>
+                      <wps:spPr>
+                        <a:xfrm flipH="1">
+                          <a:off x="0" y="0"/>
+                          <a:ext cx="1647825" cy="76200"/>
+                        </a:xfrm>
+                        <a:prstGeom prst="straightConnector1">
+                          <a:avLst/>
+                        </a:prstGeom>
+                        <a:ln>
+                          <a:tailEnd type="triangle"/>
+                        </a:ln>
+                      </wps:spPr>
+                      <wps:style>
+                        <a:lnRef idx="1">
+                          <a:schemeClr val="accent2"/>
+                        </a:lnRef>
+                        <a:fillRef idx="0">
+                          <a:schemeClr val="accent2"/>
+                        </a:fillRef>
+                        <a:effectRef idx="0">
+                          <a:schemeClr val="accent2"/>
+                        </a:effectRef>
+                        <a:fontRef idx="minor">
+                          <a:schemeClr val="tx1"/>
+                        </a:fontRef>
+                      </wps:style>
+                      <wps:bodyPr/>
+                    </wps:wsp>
+                  </a:graphicData>
+                </a:graphic>
+              </wp:anchor>
+            </w:drawing>
+          </mc:Choice>
+          <mc:Fallback>
+            <w:pict>
+              <v:shape w14:anchorId="6C225F6F" id="Conector de Seta Reta 96" o:spid="_x0000_s1026" type="#_x0000_t32" style="position:absolute;margin-left:177.75pt;margin-top:44.7pt;width:129.75pt;height:6pt;flip:x;z-index:251680768;visibility:visible;mso-wrap-style:square;mso-wrap-distance-left:9pt;mso-wrap-distance-top:0;mso-wrap-distance-right:9pt;mso-wrap-distance-bottom:0;mso-position-horizontal:absolute;mso-position-horizontal-relative:text;mso-position-vertical:absolute;mso-position-vertical-relative:text" o:gfxdata="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" strokecolor="#ed7d31 [3205]" strokeweight=".5pt">
+                <v:stroke endarrow="block" joinstyle="miter"/>
+              </v:shape>
+            </w:pict>
+          </mc:Fallback>
+        </mc:AlternateContent>
+      </w:r>
+      <w:r>
+        <w:drawing>
+          <wp:inline distT="0" distB="0" distL="0" distR="0" wp14:anchorId="509CBF45" wp14:editId="59780EBB">
+            <wp:extent cx="3116202" cy="1009650"/>
+            <wp:effectExtent l="0" t="0" r="8255" b="0"/>
+            <wp:docPr id="95" name="Imagem 95"/>
+            <wp:cNvGraphicFramePr>
+              <a:graphicFrameLocks xmlns:a="http://schemas.openxmlformats.org/drawingml/2006/main" noChangeAspect="1"/>
+            </wp:cNvGraphicFramePr>
+            <a:graphic xmlns:a="http://schemas.openxmlformats.org/drawingml/2006/main">
+              <a:graphicData uri="http://schemas.openxmlformats.org/drawingml/2006/picture">
+                <pic:pic xmlns:pic="http://schemas.openxmlformats.org/drawingml/2006/picture">
+                  <pic:nvPicPr>
+                    <pic:cNvPr id="1" name=""/>
+                    <pic:cNvPicPr/>
+                  </pic:nvPicPr>
+                  <pic:blipFill>
+                    <a:blip r:embed="rId83"/>
+                    <a:stretch>
+                      <a:fillRect/>
+                    </a:stretch>
+                  </pic:blipFill>
+                  <pic:spPr>
+                    <a:xfrm>
+                      <a:off x="0" y="0"/>
+                      <a:ext cx="3144042" cy="1018670"/>
+                    </a:xfrm>
+                    <a:prstGeom prst="rect">
+                      <a:avLst/>
+                    </a:prstGeom>
+                  </pic:spPr>
+                </pic:pic>
+              </a:graphicData>
+            </a:graphic>
+          </wp:inline>
+        </w:drawing>
+      </w:r>
+    </w:p>
+    <w:p>
+      <w:r>
+        <w:t>44- Tiramos a cor de fundo dos produtos li e adicionamos a borda conforme o código.</w:t>
+      </w:r>
+    </w:p>
+    <w:p>
+      <w:r>
+        <w:rPr>
+          <w:noProof/>
+        </w:rPr>
+        <mc:AlternateContent>
+          <mc:Choice Requires="wps">
+            <w:drawing>
+              <wp:anchor distT="0" distB="0" distL="114300" distR="114300" simplePos="0" relativeHeight="251681792" behindDoc="0" locked="0" layoutInCell="1" allowOverlap="1" wp14:anchorId="61BD992D" wp14:editId="0DD6772B">
+                <wp:simplePos x="0" y="0"/>
+                <wp:positionH relativeFrom="column">
+                  <wp:posOffset>2305050</wp:posOffset>
+                </wp:positionH>
+                <wp:positionV relativeFrom="paragraph">
+                  <wp:posOffset>1156335</wp:posOffset>
+                </wp:positionV>
+                <wp:extent cx="990600" cy="104775"/>
+                <wp:effectExtent l="38100" t="0" r="19050" b="85725"/>
+                <wp:wrapNone/>
+                <wp:docPr id="98" name="Conector de Seta Reta 98"/>
+                <wp:cNvGraphicFramePr/>
+                <a:graphic xmlns:a="http://schemas.openxmlformats.org/drawingml/2006/main">
+                  <a:graphicData uri="http://schemas.microsoft.com/office/word/2010/wordprocessingShape">
+                    <wps:wsp>
+                      <wps:cNvCnPr/>
+                      <wps:spPr>
+                        <a:xfrm flipH="1">
+                          <a:off x="0" y="0"/>
+                          <a:ext cx="990600" cy="104775"/>
+                        </a:xfrm>
+                        <a:prstGeom prst="straightConnector1">
+                          <a:avLst/>
+                        </a:prstGeom>
+                        <a:ln>
+                          <a:tailEnd type="triangle"/>
+                        </a:ln>
+                      </wps:spPr>
+                      <wps:style>
+                        <a:lnRef idx="1">
+                          <a:schemeClr val="accent2"/>
+                        </a:lnRef>
+                        <a:fillRef idx="0">
+                          <a:schemeClr val="accent2"/>
+                        </a:fillRef>
+                        <a:effectRef idx="0">
+                          <a:schemeClr val="accent2"/>
+                        </a:effectRef>
+                        <a:fontRef idx="minor">
+                          <a:schemeClr val="tx1"/>
+                        </a:fontRef>
+                      </wps:style>
+                      <wps:bodyPr/>
+                    </wps:wsp>
+                  </a:graphicData>
+                </a:graphic>
+              </wp:anchor>
+            </w:drawing>
+          </mc:Choice>
+          <mc:Fallback>
+            <w:pict>
+              <v:shape w14:anchorId="01F63CA2" id="Conector de Seta Reta 98" o:spid="_x0000_s1026" type="#_x0000_t32" style="position:absolute;margin-left:181.5pt;margin-top:91.05pt;width:78pt;height:8.25pt;flip:x;z-index:251681792;visibility:visible;mso-wrap-style:square;mso-wrap-distance-left:9pt;mso-wrap-distance-top:0;mso-wrap-distance-right:9pt;mso-wrap-distance-bottom:0;mso-position-horizontal:absolute;mso-position-horizontal-relative:text;mso-position-vertical:absolute;mso-position-vertical-relative:text" o:gfxdata="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" strokecolor="#ed7d31 [3205]" strokeweight=".5pt">
+                <v:stroke endarrow="block" joinstyle="miter"/>
+              </v:shape>
+            </w:pict>
+          </mc:Fallback>
+        </mc:AlternateContent>
+      </w:r>
+      <w:r>
+        <w:drawing>
+          <wp:inline distT="0" distB="0" distL="0" distR="0" wp14:anchorId="1B3F51E7" wp14:editId="6735C955">
+            <wp:extent cx="2896004" cy="1514686"/>
+            <wp:effectExtent l="0" t="0" r="0" b="9525"/>
+            <wp:docPr id="97" name="Imagem 97"/>
+            <wp:cNvGraphicFramePr>
+              <a:graphicFrameLocks xmlns:a="http://schemas.openxmlformats.org/drawingml/2006/main" noChangeAspect="1"/>
+            </wp:cNvGraphicFramePr>
+            <a:graphic xmlns:a="http://schemas.openxmlformats.org/drawingml/2006/main">
+              <a:graphicData uri="http://schemas.openxmlformats.org/drawingml/2006/picture">
+                <pic:pic xmlns:pic="http://schemas.openxmlformats.org/drawingml/2006/picture">
+                  <pic:nvPicPr>
+                    <pic:cNvPr id="1" name=""/>
+                    <pic:cNvPicPr/>
+                  </pic:nvPicPr>
+                  <pic:blipFill>
+                    <a:blip r:embed="rId84"/>
+                    <a:stretch>
+                      <a:fillRect/>
+                    </a:stretch>
+                  </pic:blipFill>
+                  <pic:spPr>
+                    <a:xfrm>
+                      <a:off x="0" y="0"/>
+                      <a:ext cx="2896004" cy="1514686"/>
+                    </a:xfrm>
+                    <a:prstGeom prst="rect">
+                      <a:avLst/>
+                    </a:prstGeom>
+                  </pic:spPr>
+                </pic:pic>
+              </a:graphicData>
+            </a:graphic>
+          </wp:inline>
+        </w:drawing>
+      </w:r>
+      <w:r>
+        <w:drawing>
+          <wp:inline distT="0" distB="0" distL="0" distR="0" wp14:anchorId="32F5350F" wp14:editId="04015319">
+            <wp:extent cx="5963482" cy="2610214"/>
+            <wp:effectExtent l="0" t="0" r="0" b="0"/>
+            <wp:docPr id="99" name="Imagem 99"/>
+            <wp:cNvGraphicFramePr>
+              <a:graphicFrameLocks xmlns:a="http://schemas.openxmlformats.org/drawingml/2006/main" noChangeAspect="1"/>
+            </wp:cNvGraphicFramePr>
+            <a:graphic xmlns:a="http://schemas.openxmlformats.org/drawingml/2006/main">
+              <a:graphicData uri="http://schemas.openxmlformats.org/drawingml/2006/picture">
+                <pic:pic xmlns:pic="http://schemas.openxmlformats.org/drawingml/2006/picture">
+                  <pic:nvPicPr>
+                    <pic:cNvPr id="1" name=""/>
+                    <pic:cNvPicPr/>
+                  </pic:nvPicPr>
+                  <pic:blipFill>
+                    <a:blip r:embed="rId85"/>
+                    <a:stretch>
+                      <a:fillRect/>
+                    </a:stretch>
+                  </pic:blipFill>
+                  <pic:spPr>
+                    <a:xfrm>
+                      <a:off x="0" y="0"/>
+                      <a:ext cx="5963482" cy="2610214"/>
+                    </a:xfrm>
+                    <a:prstGeom prst="rect">
+                      <a:avLst/>
+                    </a:prstGeom>
+                  </pic:spPr>
+                </pic:pic>
+              </a:graphicData>
+            </a:graphic>
+          </wp:inline>
+        </w:drawing>
+      </w:r>
+    </w:p>
+    <w:p>
+      <w:r>
+        <w:t xml:space="preserve">45- Arredondamos os cantos da nossa borda utilizando o </w:t>
+      </w:r>
+      <w:proofErr w:type="spellStart"/>
+      <w:r>
+        <w:t>border-radius</w:t>
+      </w:r>
+      <w:proofErr w:type="spellEnd"/>
+      <w:r>
+        <w:t>: 10px;</w:t>
+      </w:r>
+    </w:p>
+    <w:p>
+      <w:r>
+        <w:rPr>
+          <w:noProof/>
+        </w:rPr>
+        <mc:AlternateContent>
+          <mc:Choice Requires="wps">
+            <w:drawing>
+              <wp:anchor distT="0" distB="0" distL="114300" distR="114300" simplePos="0" relativeHeight="251682816" behindDoc="0" locked="0" layoutInCell="1" allowOverlap="1" wp14:anchorId="71A16952" wp14:editId="5831332D">
+                <wp:simplePos x="0" y="0"/>
+                <wp:positionH relativeFrom="column">
+                  <wp:posOffset>1800224</wp:posOffset>
+                </wp:positionH>
+                <wp:positionV relativeFrom="paragraph">
+                  <wp:posOffset>1230630</wp:posOffset>
+                </wp:positionV>
+                <wp:extent cx="1552575" cy="190500"/>
+                <wp:effectExtent l="38100" t="0" r="28575" b="76200"/>
+                <wp:wrapNone/>
+                <wp:docPr id="101" name="Conector de Seta Reta 101"/>
+                <wp:cNvGraphicFramePr/>
+                <a:graphic xmlns:a="http://schemas.openxmlformats.org/drawingml/2006/main">
+                  <a:graphicData uri="http://schemas.microsoft.com/office/word/2010/wordprocessingShape">
+                    <wps:wsp>
+                      <wps:cNvCnPr/>
+                      <wps:spPr>
+                        <a:xfrm flipH="1">
+                          <a:off x="0" y="0"/>
+                          <a:ext cx="1552575" cy="190500"/>
+                        </a:xfrm>
+                        <a:prstGeom prst="straightConnector1">
+                          <a:avLst/>
+                        </a:prstGeom>
+                        <a:ln>
+                          <a:tailEnd type="triangle"/>
+                        </a:ln>
+                      </wps:spPr>
+                      <wps:style>
+                        <a:lnRef idx="1">
+                          <a:schemeClr val="accent2"/>
+                        </a:lnRef>
+                        <a:fillRef idx="0">
+                          <a:schemeClr val="accent2"/>
+                        </a:fillRef>
+                        <a:effectRef idx="0">
+                          <a:schemeClr val="accent2"/>
+                        </a:effectRef>
+                        <a:fontRef idx="minor">
+                          <a:schemeClr val="tx1"/>
+                        </a:fontRef>
+                      </wps:style>
+                      <wps:bodyPr/>
+                    </wps:wsp>
+                  </a:graphicData>
+                </a:graphic>
+                <wp14:sizeRelH relativeFrom="margin">
+                  <wp14:pctWidth>0</wp14:pctWidth>
+                </wp14:sizeRelH>
+                <wp14:sizeRelV relativeFrom="margin">
+                  <wp14:pctHeight>0</wp14:pctHeight>
+                </wp14:sizeRelV>
+              </wp:anchor>
+            </w:drawing>
+          </mc:Choice>
+          <mc:Fallback>
+            <w:pict>
+              <v:shape w14:anchorId="2AA41C91" id="Conector de Seta Reta 101" o:spid="_x0000_s1026" type="#_x0000_t32" style="position:absolute;margin-left:141.75pt;margin-top:96.9pt;width:122.25pt;height:15pt;flip:x;z-index:251682816;visibility:visible;mso-wrap-style:square;mso-width-percent:0;mso-height-percent:0;mso-wrap-distance-left:9pt;mso-wrap-distance-top:0;mso-wrap-distance-right:9pt;mso-wrap-distance-bottom:0;mso-position-horizontal:absolute;mso-position-horizontal-relative:text;mso-position-vertical:absolute;mso-position-vertical-relative:text;mso-width-percent:0;mso-height-percent:0;mso-width-relative:margin;mso-height-relative:margin" o:gfxdata="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" strokecolor="#ed7d31 [3205]" strokeweight=".5pt">
+                <v:stroke endarrow="block" joinstyle="miter"/>
+              </v:shape>
+            </w:pict>
+          </mc:Fallback>
+        </mc:AlternateContent>
+      </w:r>
+      <w:r>
+        <w:drawing>
+          <wp:inline distT="0" distB="0" distL="0" distR="0" wp14:anchorId="7BAD5B60" wp14:editId="449769AF">
+            <wp:extent cx="3524742" cy="1505160"/>
+            <wp:effectExtent l="0" t="0" r="0" b="0"/>
+            <wp:docPr id="100" name="Imagem 100"/>
+            <wp:cNvGraphicFramePr>
+              <a:graphicFrameLocks xmlns:a="http://schemas.openxmlformats.org/drawingml/2006/main" noChangeAspect="1"/>
+            </wp:cNvGraphicFramePr>
+            <a:graphic xmlns:a="http://schemas.openxmlformats.org/drawingml/2006/main">
+              <a:graphicData uri="http://schemas.openxmlformats.org/drawingml/2006/picture">
+                <pic:pic xmlns:pic="http://schemas.openxmlformats.org/drawingml/2006/picture">
+                  <pic:nvPicPr>
+                    <pic:cNvPr id="1" name=""/>
+                    <pic:cNvPicPr/>
+                  </pic:nvPicPr>
+                  <pic:blipFill>
+                    <a:blip r:embed="rId86"/>
+                    <a:stretch>
+                      <a:fillRect/>
+                    </a:stretch>
+                  </pic:blipFill>
+                  <pic:spPr>
+                    <a:xfrm>
+                      <a:off x="0" y="0"/>
+                      <a:ext cx="3524742" cy="1505160"/>
+                    </a:xfrm>
+                    <a:prstGeom prst="rect">
+                      <a:avLst/>
+                    </a:prstGeom>
+                  </pic:spPr>
+                </pic:pic>
+              </a:graphicData>
+            </a:graphic>
+          </wp:inline>
+        </w:drawing>
+      </w:r>
+    </w:p>
+    <w:p>
+      <w:r>
+        <w:t>46- Vamos trabalhar com comportamento quando o usuário ao passar o mouse sobre o elemento ele realiza uma ação</w:t>
+      </w:r>
+      <w:r>
+        <w:t>,</w:t>
+      </w:r>
+      <w:r>
+        <w:t xml:space="preserve"> nessa situação, vamos trabalhar com o menu ao passar o mouse e elemento muda de cor utilizando o </w:t>
+      </w:r>
+      <w:proofErr w:type="spellStart"/>
+      <w:r>
+        <w:t>h</w:t>
+      </w:r>
+      <w:r>
+        <w:t>over</w:t>
+      </w:r>
+      <w:proofErr w:type="spellEnd"/>
+      <w:r>
+        <w:t xml:space="preserve">. </w:t>
+      </w:r>
+    </w:p>
+    <w:p>
+      <w:r>
+        <w:drawing>
+          <wp:inline distT="0" distB="0" distL="0" distR="0" wp14:anchorId="029DFC1F" wp14:editId="4B7C5140">
+            <wp:extent cx="3308988" cy="857249"/>
+            <wp:effectExtent l="0" t="0" r="5715" b="635"/>
+            <wp:docPr id="102" name="Imagem 102"/>
+            <wp:cNvGraphicFramePr>
+              <a:graphicFrameLocks xmlns:a="http://schemas.openxmlformats.org/drawingml/2006/main" noChangeAspect="1"/>
+            </wp:cNvGraphicFramePr>
+            <a:graphic xmlns:a="http://schemas.openxmlformats.org/drawingml/2006/main">
+              <a:graphicData uri="http://schemas.openxmlformats.org/drawingml/2006/picture">
+                <pic:pic xmlns:pic="http://schemas.openxmlformats.org/drawingml/2006/picture">
+                  <pic:nvPicPr>
+                    <pic:cNvPr id="1" name=""/>
+                    <pic:cNvPicPr/>
+                  </pic:nvPicPr>
+                  <pic:blipFill>
+                    <a:blip r:embed="rId87"/>
+                    <a:stretch>
+                      <a:fillRect/>
+                    </a:stretch>
+                  </pic:blipFill>
+                  <pic:spPr>
+                    <a:xfrm>
+                      <a:off x="0" y="0"/>
+                      <a:ext cx="3378794" cy="875333"/>
+                    </a:xfrm>
+                    <a:prstGeom prst="rect">
+                      <a:avLst/>
+                    </a:prstGeom>
+                  </pic:spPr>
+                </pic:pic>
+              </a:graphicData>
+            </a:graphic>
+          </wp:inline>
+        </w:drawing>
+      </w:r>
+      <w:r>
+        <w:drawing>
+          <wp:inline distT="0" distB="0" distL="0" distR="0" wp14:anchorId="33921A05" wp14:editId="5324D63E">
+            <wp:extent cx="5524500" cy="1163791"/>
+            <wp:effectExtent l="0" t="0" r="0" b="0"/>
+            <wp:docPr id="103" name="Imagem 103"/>
+            <wp:cNvGraphicFramePr>
+              <a:graphicFrameLocks xmlns:a="http://schemas.openxmlformats.org/drawingml/2006/main" noChangeAspect="1"/>
+            </wp:cNvGraphicFramePr>
+            <a:graphic xmlns:a="http://schemas.openxmlformats.org/drawingml/2006/main">
+              <a:graphicData uri="http://schemas.openxmlformats.org/drawingml/2006/picture">
+                <pic:pic xmlns:pic="http://schemas.openxmlformats.org/drawingml/2006/picture">
+                  <pic:nvPicPr>
+                    <pic:cNvPr id="1" name=""/>
+                    <pic:cNvPicPr/>
+                  </pic:nvPicPr>
+                  <pic:blipFill>
+                    <a:blip r:embed="rId88"/>
+                    <a:stretch>
+                      <a:fillRect/>
+                    </a:stretch>
+                  </pic:blipFill>
+                  <pic:spPr>
+                    <a:xfrm>
+                      <a:off x="0" y="0"/>
+                      <a:ext cx="5591037" cy="1177808"/>
+                    </a:xfrm>
+                    <a:prstGeom prst="rect">
+                      <a:avLst/>
+                    </a:prstGeom>
+                  </pic:spPr>
+                </pic:pic>
+              </a:graphicData>
+            </a:graphic>
+          </wp:inline>
+        </w:drawing>
+      </w:r>
+    </w:p>
+    <w:p>
+      <w:r>
+        <w:t xml:space="preserve">47- Ainda trabalhando com </w:t>
+      </w:r>
+      <w:proofErr w:type="spellStart"/>
+      <w:r>
+        <w:t>hover</w:t>
+      </w:r>
+      <w:proofErr w:type="spellEnd"/>
+      <w:r>
+        <w:t xml:space="preserve"> ao passar o mouse adicionamos uma linha em cada item do menu.</w:t>
+      </w:r>
+    </w:p>
+    <w:p>
+      <w:r>
+        <w:drawing>
+          <wp:inline distT="0" distB="0" distL="0" distR="0" wp14:anchorId="4315F22D" wp14:editId="013725C6">
+            <wp:extent cx="4229100" cy="1144996"/>
+            <wp:effectExtent l="0" t="0" r="0" b="0"/>
+            <wp:docPr id="104" name="Imagem 104"/>
+            <wp:cNvGraphicFramePr>
+              <a:graphicFrameLocks xmlns:a="http://schemas.openxmlformats.org/drawingml/2006/main" noChangeAspect="1"/>
+            </wp:cNvGraphicFramePr>
+            <a:graphic xmlns:a="http://schemas.openxmlformats.org/drawingml/2006/main">
+              <a:graphicData uri="http://schemas.openxmlformats.org/drawingml/2006/picture">
+                <pic:pic xmlns:pic="http://schemas.openxmlformats.org/drawingml/2006/picture">
+                  <pic:nvPicPr>
+                    <pic:cNvPr id="1" name=""/>
+                    <pic:cNvPicPr/>
+                  </pic:nvPicPr>
+                  <pic:blipFill>
+                    <a:blip r:embed="rId89"/>
+                    <a:stretch>
+                      <a:fillRect/>
+                    </a:stretch>
+                  </pic:blipFill>
+                  <pic:spPr>
+                    <a:xfrm>
+                      <a:off x="0" y="0"/>
+                      <a:ext cx="4297687" cy="1163565"/>
+                    </a:xfrm>
+                    <a:prstGeom prst="rect">
+                      <a:avLst/>
+                    </a:prstGeom>
+                  </pic:spPr>
+                </pic:pic>
+              </a:graphicData>
+            </a:graphic>
+          </wp:inline>
+        </w:drawing>
+      </w:r>
+    </w:p>
+    <w:p>
+      <w:r>
+        <w:t>48 – Mudamos a cor da borda ao passar o mouse.</w:t>
+      </w:r>
+    </w:p>
     <w:p>
       <w:bookmarkStart w:id="0" w:name="_GoBack"/>
+      <w:r>
+        <w:drawing>
+          <wp:inline distT="0" distB="0" distL="0" distR="0" wp14:anchorId="643DD41D" wp14:editId="221924E7">
+            <wp:extent cx="3036277" cy="609600"/>
+            <wp:effectExtent l="0" t="0" r="0" b="0"/>
+            <wp:docPr id="105" name="Imagem 105"/>
+            <wp:cNvGraphicFramePr>
+              <a:graphicFrameLocks xmlns:a="http://schemas.openxmlformats.org/drawingml/2006/main" noChangeAspect="1"/>
+            </wp:cNvGraphicFramePr>
+            <a:graphic xmlns:a="http://schemas.openxmlformats.org/drawingml/2006/main">
+              <a:graphicData uri="http://schemas.openxmlformats.org/drawingml/2006/picture">
+                <pic:pic xmlns:pic="http://schemas.openxmlformats.org/drawingml/2006/picture">
+                  <pic:nvPicPr>
+                    <pic:cNvPr id="1" name=""/>
+                    <pic:cNvPicPr/>
+                  </pic:nvPicPr>
+                  <pic:blipFill>
+                    <a:blip r:embed="rId90"/>
+                    <a:stretch>
+                      <a:fillRect/>
+                    </a:stretch>
+                  </pic:blipFill>
+                  <pic:spPr>
+                    <a:xfrm>
+                      <a:off x="0" y="0"/>
+                      <a:ext cx="3047426" cy="611838"/>
+                    </a:xfrm>
+                    <a:prstGeom prst="rect">
+                      <a:avLst/>
+                    </a:prstGeom>
+                  </pic:spPr>
+                </pic:pic>
+              </a:graphicData>
+            </a:graphic>
+          </wp:inline>
+        </w:drawing>
+      </w:r>
       <w:bookmarkEnd w:id="0"/>
     </w:p>
+    <w:p/>
     <w:sectPr>
       <w:pgSz w:w="11906" w:h="16838"/>
       <w:pgMar w:top="1417" w:right="1701" w:bottom="1417" w:left="1701" w:header="708" w:footer="708" w:gutter="0"/>
@@ -5375,15 +7492,6 @@
 </file>
 
 <file path=customXml/item1.xml><?xml version="1.0" encoding="utf-8"?>
-<?mso-contentType ?>
-<FormTemplates xmlns="http://schemas.microsoft.com/sharepoint/v3/contenttype/forms">
-  <Display>DocumentLibraryForm</Display>
-  <Edit>DocumentLibraryForm</Edit>
-  <New>DocumentLibraryForm</New>
-</FormTemplates>
-</file>
-
-<file path=customXml/item2.xml><?xml version="1.0" encoding="utf-8"?>
 <p:properties xmlns:p="http://schemas.microsoft.com/office/2006/metadata/properties" xmlns:xsi="http://www.w3.org/2001/XMLSchema-instance" xmlns:pc="http://schemas.microsoft.com/office/infopath/2007/PartnerControls">
   <documentManagement>
     <_activity xmlns="8437a765-f0a9-40aa-978b-fcc06261281f" xsi:nil="true"/>
@@ -5391,7 +7499,7 @@
 </p:properties>
 </file>
 
-<file path=customXml/item3.xml><?xml version="1.0" encoding="utf-8"?>
+<file path=customXml/item2.xml><?xml version="1.0" encoding="utf-8"?>
 <ct:contentTypeSchema xmlns:ct="http://schemas.microsoft.com/office/2006/metadata/contentType" xmlns:ma="http://schemas.microsoft.com/office/2006/metadata/properties/metaAttributes" ct:_="" ma:_="" ma:contentTypeName="Documento" ma:contentTypeID="0x01010034B17ED9C83E394791ACA33DA9287452" ma:contentTypeVersion="16" ma:contentTypeDescription="Crie um novo documento." ma:contentTypeScope="" ma:versionID="d36ce64b1b29120840e9f9b956471cbb">
   <xsd:schema xmlns:xsd="http://www.w3.org/2001/XMLSchema" xmlns:xs="http://www.w3.org/2001/XMLSchema" xmlns:p="http://schemas.microsoft.com/office/2006/metadata/properties" xmlns:ns3="8437a765-f0a9-40aa-978b-fcc06261281f" xmlns:ns4="e78d8b06-d887-4705-9cec-751f2fb2cee2" targetNamespace="http://schemas.microsoft.com/office/2006/metadata/properties" ma:root="true" ma:fieldsID="ab1d645bb15f72c0dfc8a8f602f1de6b" ns3:_="" ns4:_="">
     <xsd:import namespace="8437a765-f0a9-40aa-978b-fcc06261281f"/>
@@ -5630,19 +7738,20 @@
 </ct:contentTypeSchema>
 </file>
 
+<file path=customXml/item3.xml><?xml version="1.0" encoding="utf-8"?>
+<?mso-contentType ?>
+<FormTemplates xmlns="http://schemas.microsoft.com/sharepoint/v3/contenttype/forms">
+  <Display>DocumentLibraryForm</Display>
+  <Edit>DocumentLibraryForm</Edit>
+  <New>DocumentLibraryForm</New>
+</FormTemplates>
+</file>
+
 <file path=customXml/item4.xml><?xml version="1.0" encoding="utf-8"?>
 <b:Sources xmlns:b="http://schemas.openxmlformats.org/officeDocument/2006/bibliography" xmlns="http://schemas.openxmlformats.org/officeDocument/2006/bibliography" SelectedStyle="\APASixthEditionOfficeOnline.xsl" StyleName="APA" Version="6"/>
 </file>
 
 <file path=customXml/itemProps1.xml><?xml version="1.0" encoding="utf-8"?>
-<ds:datastoreItem xmlns:ds="http://schemas.openxmlformats.org/officeDocument/2006/customXml" ds:itemID="{38630907-5F1E-4561-A45F-AC7CC415CD73}">
-  <ds:schemaRefs>
-    <ds:schemaRef ds:uri="http://schemas.microsoft.com/sharepoint/v3/contenttype/forms"/>
-  </ds:schemaRefs>
-</ds:datastoreItem>
-</file>
-
-<file path=customXml/itemProps2.xml><?xml version="1.0" encoding="utf-8"?>
 <ds:datastoreItem xmlns:ds="http://schemas.openxmlformats.org/officeDocument/2006/customXml" ds:itemID="{0C9FFCBC-F2CA-4FF1-AAFC-AD3B89BB1967}">
   <ds:schemaRefs>
     <ds:schemaRef ds:uri="http://schemas.microsoft.com/office/2006/metadata/properties"/>
@@ -5652,7 +7761,7 @@
 </ds:datastoreItem>
 </file>
 
-<file path=customXml/itemProps3.xml><?xml version="1.0" encoding="utf-8"?>
+<file path=customXml/itemProps2.xml><?xml version="1.0" encoding="utf-8"?>
 <ds:datastoreItem xmlns:ds="http://schemas.openxmlformats.org/officeDocument/2006/customXml" ds:itemID="{5D63F5B6-DF50-4CAF-997C-1D8B1776178E}">
   <ds:schemaRefs>
     <ds:schemaRef ds:uri="http://schemas.microsoft.com/office/2006/metadata/contentType"/>
@@ -5671,8 +7780,16 @@
 </ds:datastoreItem>
 </file>
 
+<file path=customXml/itemProps3.xml><?xml version="1.0" encoding="utf-8"?>
+<ds:datastoreItem xmlns:ds="http://schemas.openxmlformats.org/officeDocument/2006/customXml" ds:itemID="{38630907-5F1E-4561-A45F-AC7CC415CD73}">
+  <ds:schemaRefs>
+    <ds:schemaRef ds:uri="http://schemas.microsoft.com/sharepoint/v3/contenttype/forms"/>
+  </ds:schemaRefs>
+</ds:datastoreItem>
+</file>
+
 <file path=customXml/itemProps4.xml><?xml version="1.0" encoding="utf-8"?>
-<ds:datastoreItem xmlns:ds="http://schemas.openxmlformats.org/officeDocument/2006/customXml" ds:itemID="{9D5BA650-55E7-4786-AC59-C71CF20E0E21}">
+<ds:datastoreItem xmlns:ds="http://schemas.openxmlformats.org/officeDocument/2006/customXml" ds:itemID="{FF02FD22-42B3-40DE-95C6-84B8ECA0F4D6}">
   <ds:schemaRefs>
     <ds:schemaRef ds:uri="http://schemas.openxmlformats.org/officeDocument/2006/bibliography"/>
   </ds:schemaRefs>

</xml_diff>

<commit_message>
atualização da aula dia 10/09/26
</commit_message>
<xml_diff>
--- a/apostila/Projeto Space for me3.docx
+++ b/apostila/Projeto Space for me3.docx
@@ -5502,7 +5502,7 @@
           <w:noProof/>
         </w:rPr>
         <w:drawing>
-          <wp:inline distT="0" distB="0" distL="0" distR="0" wp14:anchorId="2CC963F3" wp14:editId="61F8B75E">
+          <wp:inline distT="0" distB="0" distL="0" distR="0" wp14:anchorId="2CC963F3" wp14:editId="494D00AB">
             <wp:extent cx="4637159" cy="2171700"/>
             <wp:effectExtent l="0" t="0" r="0" b="0"/>
             <wp:docPr id="87" name="Imagem 87"/>
@@ -5548,6 +5548,9 @@
     </w:p>
     <w:p>
       <w:r>
+        <w:rPr>
+          <w:noProof/>
+        </w:rPr>
         <w:drawing>
           <wp:inline distT="0" distB="0" distL="0" distR="0" wp14:anchorId="4AB1D17B" wp14:editId="53F34633">
             <wp:extent cx="3818534" cy="1657350"/>
@@ -5585,6 +5588,9 @@
         </w:drawing>
       </w:r>
       <w:r>
+        <w:rPr>
+          <w:noProof/>
+        </w:rPr>
         <w:drawing>
           <wp:inline distT="0" distB="0" distL="0" distR="0" wp14:anchorId="3D07E6A1" wp14:editId="11B985AD">
             <wp:extent cx="4598035" cy="2332144"/>
@@ -5703,6 +5709,9 @@
         </mc:AlternateContent>
       </w:r>
       <w:r>
+        <w:rPr>
+          <w:noProof/>
+        </w:rPr>
         <w:drawing>
           <wp:inline distT="0" distB="0" distL="0" distR="0" wp14:anchorId="12C86BBC" wp14:editId="41943813">
             <wp:extent cx="3920924" cy="2286000"/>
@@ -5740,6 +5749,9 @@
         </w:drawing>
       </w:r>
       <w:r>
+        <w:rPr>
+          <w:noProof/>
+        </w:rPr>
         <w:drawing>
           <wp:inline distT="0" distB="0" distL="0" distR="0" wp14:anchorId="11E72C90" wp14:editId="0632CB74">
             <wp:extent cx="6553200" cy="2828925"/>
@@ -5866,6 +5878,9 @@
         </mc:AlternateContent>
       </w:r>
       <w:r>
+        <w:rPr>
+          <w:noProof/>
+        </w:rPr>
         <w:drawing>
           <wp:inline distT="0" distB="0" distL="0" distR="0" wp14:anchorId="509CBF45" wp14:editId="59780EBB">
             <wp:extent cx="3116202" cy="1009650"/>
@@ -5916,13 +5931,13 @@
         <mc:AlternateContent>
           <mc:Choice Requires="wps">
             <w:drawing>
-              <wp:anchor distT="0" distB="0" distL="114300" distR="114300" simplePos="0" relativeHeight="251681792" behindDoc="0" locked="0" layoutInCell="1" allowOverlap="1" wp14:anchorId="61BD992D" wp14:editId="0DD6772B">
+              <wp:anchor distT="0" distB="0" distL="114300" distR="114300" simplePos="0" relativeHeight="251681792" behindDoc="0" locked="0" layoutInCell="1" allowOverlap="1" wp14:anchorId="61BD992D" wp14:editId="60E5014A">
                 <wp:simplePos x="0" y="0"/>
                 <wp:positionH relativeFrom="column">
-                  <wp:posOffset>2305050</wp:posOffset>
+                  <wp:posOffset>2371725</wp:posOffset>
                 </wp:positionH>
                 <wp:positionV relativeFrom="paragraph">
-                  <wp:posOffset>1156335</wp:posOffset>
+                  <wp:posOffset>1613535</wp:posOffset>
                 </wp:positionV>
                 <wp:extent cx="990600" cy="104775"/>
                 <wp:effectExtent l="38100" t="0" r="19050" b="85725"/>
@@ -5968,7 +5983,11 @@
           </mc:Choice>
           <mc:Fallback>
             <w:pict>
-              <v:shape w14:anchorId="01F63CA2" id="Conector de Seta Reta 98" o:spid="_x0000_s1026" type="#_x0000_t32" style="position:absolute;margin-left:181.5pt;margin-top:91.05pt;width:78pt;height:8.25pt;flip:x;z-index:251681792;visibility:visible;mso-wrap-style:square;mso-wrap-distance-left:9pt;mso-wrap-distance-top:0;mso-wrap-distance-right:9pt;mso-wrap-distance-bottom:0;mso-position-horizontal:absolute;mso-position-horizontal-relative:text;mso-position-vertical:absolute;mso-position-vertical-relative:text" o:gfxdata="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" strokecolor="#ed7d31 [3205]" strokeweight=".5pt">
+              <v:shapetype w14:anchorId="1E83A74A" id="_x0000_t32" coordsize="21600,21600" o:spt="32" o:oned="t" path="m,l21600,21600e" filled="f">
+                <v:path arrowok="t" fillok="f" o:connecttype="none"/>
+                <o:lock v:ext="edit" shapetype="t"/>
+              </v:shapetype>
+              <v:shape id="Conector de Seta Reta 98" o:spid="_x0000_s1026" type="#_x0000_t32" style="position:absolute;margin-left:186.75pt;margin-top:127.05pt;width:78pt;height:8.25pt;flip:x;z-index:251681792;visibility:visible;mso-wrap-style:square;mso-wrap-distance-left:9pt;mso-wrap-distance-top:0;mso-wrap-distance-right:9pt;mso-wrap-distance-bottom:0;mso-position-horizontal:absolute;mso-position-horizontal-relative:text;mso-position-vertical:absolute;mso-position-vertical-relative:text" o:gfxdata="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" strokecolor="#ed7d31 [3205]" strokeweight=".5pt">
                 <v:stroke endarrow="block" joinstyle="miter"/>
               </v:shape>
             </w:pict>
@@ -5976,6 +5995,9 @@
         </mc:AlternateContent>
       </w:r>
       <w:r>
+        <w:rPr>
+          <w:noProof/>
+        </w:rPr>
         <w:drawing>
           <wp:inline distT="0" distB="0" distL="0" distR="0" wp14:anchorId="1B3F51E7" wp14:editId="6735C955">
             <wp:extent cx="2896004" cy="1514686"/>
@@ -6014,10 +6036,10 @@
       </w:r>
       <w:r>
         <w:drawing>
-          <wp:inline distT="0" distB="0" distL="0" distR="0" wp14:anchorId="32F5350F" wp14:editId="04015319">
-            <wp:extent cx="5963482" cy="2610214"/>
-            <wp:effectExtent l="0" t="0" r="0" b="0"/>
-            <wp:docPr id="99" name="Imagem 99"/>
+          <wp:inline distT="0" distB="0" distL="0" distR="0" wp14:anchorId="5E2F44DD" wp14:editId="37A99C78">
+            <wp:extent cx="4813300" cy="1962150"/>
+            <wp:effectExtent l="0" t="0" r="6350" b="0"/>
+            <wp:docPr id="89" name="Imagem 89"/>
             <wp:cNvGraphicFramePr>
               <a:graphicFrameLocks xmlns:a="http://schemas.openxmlformats.org/drawingml/2006/main" noChangeAspect="1"/>
             </wp:cNvGraphicFramePr>
@@ -6037,7 +6059,7 @@
                   <pic:spPr>
                     <a:xfrm>
                       <a:off x="0" y="0"/>
-                      <a:ext cx="5963482" cy="2610214"/>
+                      <a:ext cx="4882026" cy="1990166"/>
                     </a:xfrm>
                     <a:prstGeom prst="rect">
                       <a:avLst/>
@@ -6137,6 +6159,9 @@
         </mc:AlternateContent>
       </w:r>
       <w:r>
+        <w:rPr>
+          <w:noProof/>
+        </w:rPr>
         <w:drawing>
           <wp:inline distT="0" distB="0" distL="0" distR="0" wp14:anchorId="7BAD5B60" wp14:editId="449769AF">
             <wp:extent cx="3524742" cy="1505160"/>
@@ -6198,6 +6223,9 @@
     </w:p>
     <w:p>
       <w:r>
+        <w:rPr>
+          <w:noProof/>
+        </w:rPr>
         <w:drawing>
           <wp:inline distT="0" distB="0" distL="0" distR="0" wp14:anchorId="029DFC1F" wp14:editId="4B7C5140">
             <wp:extent cx="3308988" cy="857249"/>
@@ -6235,6 +6263,9 @@
         </w:drawing>
       </w:r>
       <w:r>
+        <w:rPr>
+          <w:noProof/>
+        </w:rPr>
         <w:drawing>
           <wp:inline distT="0" distB="0" distL="0" distR="0" wp14:anchorId="33921A05" wp14:editId="5324D63E">
             <wp:extent cx="5524500" cy="1163791"/>
@@ -6287,6 +6318,9 @@
     </w:p>
     <w:p>
       <w:r>
+        <w:rPr>
+          <w:noProof/>
+        </w:rPr>
         <w:drawing>
           <wp:inline distT="0" distB="0" distL="0" distR="0" wp14:anchorId="4315F22D" wp14:editId="013725C6">
             <wp:extent cx="4229100" cy="1144996"/>
@@ -6330,47 +6364,443 @@
       </w:r>
     </w:p>
     <w:p>
+      <w:r>
+        <w:drawing>
+          <wp:inline distT="0" distB="0" distL="0" distR="0" wp14:anchorId="1CB33493" wp14:editId="21F4AAA5">
+            <wp:extent cx="3877216" cy="485843"/>
+            <wp:effectExtent l="0" t="0" r="0" b="9525"/>
+            <wp:docPr id="106" name="Imagem 106"/>
+            <wp:cNvGraphicFramePr>
+              <a:graphicFrameLocks xmlns:a="http://schemas.openxmlformats.org/drawingml/2006/main" noChangeAspect="1"/>
+            </wp:cNvGraphicFramePr>
+            <a:graphic xmlns:a="http://schemas.openxmlformats.org/drawingml/2006/main">
+              <a:graphicData uri="http://schemas.openxmlformats.org/drawingml/2006/picture">
+                <pic:pic xmlns:pic="http://schemas.openxmlformats.org/drawingml/2006/picture">
+                  <pic:nvPicPr>
+                    <pic:cNvPr id="1" name=""/>
+                    <pic:cNvPicPr/>
+                  </pic:nvPicPr>
+                  <pic:blipFill>
+                    <a:blip r:embed="rId90"/>
+                    <a:stretch>
+                      <a:fillRect/>
+                    </a:stretch>
+                  </pic:blipFill>
+                  <pic:spPr>
+                    <a:xfrm>
+                      <a:off x="0" y="0"/>
+                      <a:ext cx="3877216" cy="485843"/>
+                    </a:xfrm>
+                    <a:prstGeom prst="rect">
+                      <a:avLst/>
+                    </a:prstGeom>
+                  </pic:spPr>
+                </pic:pic>
+              </a:graphicData>
+            </a:graphic>
+          </wp:inline>
+        </w:drawing>
+      </w:r>
+    </w:p>
+    <w:p>
+      <w:r>
+        <w:t xml:space="preserve">49- Mudamos a cor da borda ao clicar sobre ela utilizando o </w:t>
+      </w:r>
+      <w:proofErr w:type="spellStart"/>
+      <w:r>
+        <w:t>active</w:t>
+      </w:r>
+      <w:proofErr w:type="spellEnd"/>
+      <w:r>
+        <w:t>.</w:t>
+      </w:r>
+      <w:r>
+        <w:t xml:space="preserve"> </w:t>
+      </w:r>
+    </w:p>
+    <w:p>
+      <w:r>
+        <w:drawing>
+          <wp:inline distT="0" distB="0" distL="0" distR="0" wp14:anchorId="7E72A7AD" wp14:editId="0F97834C">
+            <wp:extent cx="3418205" cy="1057225"/>
+            <wp:effectExtent l="0" t="0" r="0" b="0"/>
+            <wp:docPr id="107" name="Imagem 107"/>
+            <wp:cNvGraphicFramePr>
+              <a:graphicFrameLocks xmlns:a="http://schemas.openxmlformats.org/drawingml/2006/main" noChangeAspect="1"/>
+            </wp:cNvGraphicFramePr>
+            <a:graphic xmlns:a="http://schemas.openxmlformats.org/drawingml/2006/main">
+              <a:graphicData uri="http://schemas.openxmlformats.org/drawingml/2006/picture">
+                <pic:pic xmlns:pic="http://schemas.openxmlformats.org/drawingml/2006/picture">
+                  <pic:nvPicPr>
+                    <pic:cNvPr id="1" name=""/>
+                    <pic:cNvPicPr/>
+                  </pic:nvPicPr>
+                  <pic:blipFill>
+                    <a:blip r:embed="rId91"/>
+                    <a:stretch>
+                      <a:fillRect/>
+                    </a:stretch>
+                  </pic:blipFill>
+                  <pic:spPr>
+                    <a:xfrm>
+                      <a:off x="0" y="0"/>
+                      <a:ext cx="3485661" cy="1078089"/>
+                    </a:xfrm>
+                    <a:prstGeom prst="rect">
+                      <a:avLst/>
+                    </a:prstGeom>
+                  </pic:spPr>
+                </pic:pic>
+              </a:graphicData>
+            </a:graphic>
+          </wp:inline>
+        </w:drawing>
+      </w:r>
+    </w:p>
+    <w:p>
+      <w:r>
+        <w:drawing>
+          <wp:inline distT="0" distB="0" distL="0" distR="0" wp14:anchorId="643BEE5E" wp14:editId="6A3466E2">
+            <wp:extent cx="4009202" cy="1842066"/>
+            <wp:effectExtent l="0" t="0" r="0" b="6350"/>
+            <wp:docPr id="109" name="Imagem 109"/>
+            <wp:cNvGraphicFramePr>
+              <a:graphicFrameLocks xmlns:a="http://schemas.openxmlformats.org/drawingml/2006/main" noChangeAspect="1"/>
+            </wp:cNvGraphicFramePr>
+            <a:graphic xmlns:a="http://schemas.openxmlformats.org/drawingml/2006/main">
+              <a:graphicData uri="http://schemas.openxmlformats.org/drawingml/2006/picture">
+                <pic:pic xmlns:pic="http://schemas.openxmlformats.org/drawingml/2006/picture">
+                  <pic:nvPicPr>
+                    <pic:cNvPr id="1" name=""/>
+                    <pic:cNvPicPr/>
+                  </pic:nvPicPr>
+                  <pic:blipFill>
+                    <a:blip r:embed="rId92"/>
+                    <a:stretch>
+                      <a:fillRect/>
+                    </a:stretch>
+                  </pic:blipFill>
+                  <pic:spPr>
+                    <a:xfrm>
+                      <a:off x="0" y="0"/>
+                      <a:ext cx="4116380" cy="1891310"/>
+                    </a:xfrm>
+                    <a:prstGeom prst="rect">
+                      <a:avLst/>
+                    </a:prstGeom>
+                  </pic:spPr>
+                </pic:pic>
+              </a:graphicData>
+            </a:graphic>
+          </wp:inline>
+        </w:drawing>
+      </w:r>
+    </w:p>
+    <w:p>
+      <w:r>
+        <w:t xml:space="preserve">50- </w:t>
+      </w:r>
+      <w:r>
+        <w:t xml:space="preserve">Agora vamos deixar a nossa página mais interativa colocando um </w:t>
+      </w:r>
+      <w:proofErr w:type="spellStart"/>
+      <w:r>
+        <w:t>hover</w:t>
+      </w:r>
+      <w:proofErr w:type="spellEnd"/>
+      <w:r>
+        <w:t xml:space="preserve"> no t</w:t>
+      </w:r>
+      <w:r>
+        <w:t>í</w:t>
+      </w:r>
+      <w:r>
+        <w:t xml:space="preserve">tulo </w:t>
+      </w:r>
+      <w:r>
+        <w:t>ou</w:t>
+      </w:r>
+      <w:r>
+        <w:t>,</w:t>
+      </w:r>
+      <w:r>
+        <w:t xml:space="preserve"> seja vamos passar o mouse ele vai aumentar de tamanho passando uma impressão que a imagem está se movendo.</w:t>
+      </w:r>
+    </w:p>
+    <w:p>
+      <w:r>
+        <w:drawing>
+          <wp:inline distT="0" distB="0" distL="0" distR="0" wp14:anchorId="4C3D850A" wp14:editId="6F25B5B5">
+            <wp:extent cx="1409897" cy="466790"/>
+            <wp:effectExtent l="0" t="0" r="0" b="9525"/>
+            <wp:docPr id="110" name="Imagem 110"/>
+            <wp:cNvGraphicFramePr>
+              <a:graphicFrameLocks xmlns:a="http://schemas.openxmlformats.org/drawingml/2006/main" noChangeAspect="1"/>
+            </wp:cNvGraphicFramePr>
+            <a:graphic xmlns:a="http://schemas.openxmlformats.org/drawingml/2006/main">
+              <a:graphicData uri="http://schemas.openxmlformats.org/drawingml/2006/picture">
+                <pic:pic xmlns:pic="http://schemas.openxmlformats.org/drawingml/2006/picture">
+                  <pic:nvPicPr>
+                    <pic:cNvPr id="1" name=""/>
+                    <pic:cNvPicPr/>
+                  </pic:nvPicPr>
+                  <pic:blipFill>
+                    <a:blip r:embed="rId93"/>
+                    <a:stretch>
+                      <a:fillRect/>
+                    </a:stretch>
+                  </pic:blipFill>
+                  <pic:spPr>
+                    <a:xfrm>
+                      <a:off x="0" y="0"/>
+                      <a:ext cx="1409897" cy="466790"/>
+                    </a:xfrm>
+                    <a:prstGeom prst="rect">
+                      <a:avLst/>
+                    </a:prstGeom>
+                  </pic:spPr>
+                </pic:pic>
+              </a:graphicData>
+            </a:graphic>
+          </wp:inline>
+        </w:drawing>
+      </w:r>
+    </w:p>
+    <w:p>
+      <w:r>
+        <w:t xml:space="preserve">51- Adicionamos uma imagem ao </w:t>
+      </w:r>
+      <w:proofErr w:type="spellStart"/>
+      <w:r>
+        <w:t>footer</w:t>
+      </w:r>
+      <w:proofErr w:type="spellEnd"/>
+      <w:r>
+        <w:t xml:space="preserve"> conforme o código.</w:t>
+      </w:r>
+    </w:p>
+    <w:p>
+      <w:r>
+        <w:drawing>
+          <wp:inline distT="0" distB="0" distL="0" distR="0" wp14:anchorId="7FF19277" wp14:editId="718CEB32">
+            <wp:extent cx="4001058" cy="466790"/>
+            <wp:effectExtent l="0" t="0" r="0" b="9525"/>
+            <wp:docPr id="112" name="Imagem 112"/>
+            <wp:cNvGraphicFramePr>
+              <a:graphicFrameLocks xmlns:a="http://schemas.openxmlformats.org/drawingml/2006/main" noChangeAspect="1"/>
+            </wp:cNvGraphicFramePr>
+            <a:graphic xmlns:a="http://schemas.openxmlformats.org/drawingml/2006/main">
+              <a:graphicData uri="http://schemas.openxmlformats.org/drawingml/2006/picture">
+                <pic:pic xmlns:pic="http://schemas.openxmlformats.org/drawingml/2006/picture">
+                  <pic:nvPicPr>
+                    <pic:cNvPr id="1" name=""/>
+                    <pic:cNvPicPr/>
+                  </pic:nvPicPr>
+                  <pic:blipFill>
+                    <a:blip r:embed="rId94"/>
+                    <a:stretch>
+                      <a:fillRect/>
+                    </a:stretch>
+                  </pic:blipFill>
+                  <pic:spPr>
+                    <a:xfrm>
+                      <a:off x="0" y="0"/>
+                      <a:ext cx="4001058" cy="466790"/>
+                    </a:xfrm>
+                    <a:prstGeom prst="rect">
+                      <a:avLst/>
+                    </a:prstGeom>
+                  </pic:spPr>
+                </pic:pic>
+              </a:graphicData>
+            </a:graphic>
+          </wp:inline>
+        </w:drawing>
+      </w:r>
+    </w:p>
+    <w:p>
+      <w:r>
+        <w:t xml:space="preserve">52- Como a imagem do </w:t>
+      </w:r>
+      <w:proofErr w:type="spellStart"/>
+      <w:r>
+        <w:t>footer</w:t>
+      </w:r>
+      <w:proofErr w:type="spellEnd"/>
+      <w:r>
+        <w:t xml:space="preserve"> é branca precisamos adicionar uma cor de fundo.</w:t>
+      </w:r>
       <w:bookmarkStart w:id="0" w:name="_GoBack"/>
-      <w:r>
-        <w:drawing>
-          <wp:inline distT="0" distB="0" distL="0" distR="0" wp14:anchorId="643DD41D" wp14:editId="221924E7">
-            <wp:extent cx="3036277" cy="609600"/>
-            <wp:effectExtent l="0" t="0" r="0" b="0"/>
-            <wp:docPr id="105" name="Imagem 105"/>
-            <wp:cNvGraphicFramePr>
-              <a:graphicFrameLocks xmlns:a="http://schemas.openxmlformats.org/drawingml/2006/main" noChangeAspect="1"/>
-            </wp:cNvGraphicFramePr>
-            <a:graphic xmlns:a="http://schemas.openxmlformats.org/drawingml/2006/main">
-              <a:graphicData uri="http://schemas.openxmlformats.org/drawingml/2006/picture">
-                <pic:pic xmlns:pic="http://schemas.openxmlformats.org/drawingml/2006/picture">
-                  <pic:nvPicPr>
-                    <pic:cNvPr id="1" name=""/>
-                    <pic:cNvPicPr/>
-                  </pic:nvPicPr>
-                  <pic:blipFill>
-                    <a:blip r:embed="rId90"/>
-                    <a:stretch>
-                      <a:fillRect/>
-                    </a:stretch>
-                  </pic:blipFill>
-                  <pic:spPr>
-                    <a:xfrm>
-                      <a:off x="0" y="0"/>
-                      <a:ext cx="3047426" cy="611838"/>
-                    </a:xfrm>
-                    <a:prstGeom prst="rect">
-                      <a:avLst/>
-                    </a:prstGeom>
-                  </pic:spPr>
-                </pic:pic>
-              </a:graphicData>
-            </a:graphic>
-          </wp:inline>
-        </w:drawing>
-      </w:r>
       <w:bookmarkEnd w:id="0"/>
     </w:p>
-    <w:p/>
+    <w:p>
+      <w:r>
+        <w:drawing>
+          <wp:inline distT="0" distB="0" distL="0" distR="0" wp14:anchorId="764EA872" wp14:editId="42A10E8E">
+            <wp:extent cx="2448267" cy="724001"/>
+            <wp:effectExtent l="0" t="0" r="9525" b="0"/>
+            <wp:docPr id="113" name="Imagem 113"/>
+            <wp:cNvGraphicFramePr>
+              <a:graphicFrameLocks xmlns:a="http://schemas.openxmlformats.org/drawingml/2006/main" noChangeAspect="1"/>
+            </wp:cNvGraphicFramePr>
+            <a:graphic xmlns:a="http://schemas.openxmlformats.org/drawingml/2006/main">
+              <a:graphicData uri="http://schemas.openxmlformats.org/drawingml/2006/picture">
+                <pic:pic xmlns:pic="http://schemas.openxmlformats.org/drawingml/2006/picture">
+                  <pic:nvPicPr>
+                    <pic:cNvPr id="1" name=""/>
+                    <pic:cNvPicPr/>
+                  </pic:nvPicPr>
+                  <pic:blipFill>
+                    <a:blip r:embed="rId95"/>
+                    <a:stretch>
+                      <a:fillRect/>
+                    </a:stretch>
+                  </pic:blipFill>
+                  <pic:spPr>
+                    <a:xfrm>
+                      <a:off x="0" y="0"/>
+                      <a:ext cx="2448267" cy="724001"/>
+                    </a:xfrm>
+                    <a:prstGeom prst="rect">
+                      <a:avLst/>
+                    </a:prstGeom>
+                  </pic:spPr>
+                </pic:pic>
+              </a:graphicData>
+            </a:graphic>
+          </wp:inline>
+        </w:drawing>
+      </w:r>
+      <w:r>
+        <w:drawing>
+          <wp:inline distT="0" distB="0" distL="0" distR="0" wp14:anchorId="7E12A4CC" wp14:editId="089C8B31">
+            <wp:extent cx="4968766" cy="1162050"/>
+            <wp:effectExtent l="0" t="0" r="3810" b="0"/>
+            <wp:docPr id="115" name="Imagem 115"/>
+            <wp:cNvGraphicFramePr>
+              <a:graphicFrameLocks xmlns:a="http://schemas.openxmlformats.org/drawingml/2006/main" noChangeAspect="1"/>
+            </wp:cNvGraphicFramePr>
+            <a:graphic xmlns:a="http://schemas.openxmlformats.org/drawingml/2006/main">
+              <a:graphicData uri="http://schemas.openxmlformats.org/drawingml/2006/picture">
+                <pic:pic xmlns:pic="http://schemas.openxmlformats.org/drawingml/2006/picture">
+                  <pic:nvPicPr>
+                    <pic:cNvPr id="1" name=""/>
+                    <pic:cNvPicPr/>
+                  </pic:nvPicPr>
+                  <pic:blipFill>
+                    <a:blip r:embed="rId96"/>
+                    <a:stretch>
+                      <a:fillRect/>
+                    </a:stretch>
+                  </pic:blipFill>
+                  <pic:spPr>
+                    <a:xfrm>
+                      <a:off x="0" y="0"/>
+                      <a:ext cx="5094402" cy="1191433"/>
+                    </a:xfrm>
+                    <a:prstGeom prst="rect">
+                      <a:avLst/>
+                    </a:prstGeom>
+                  </pic:spPr>
+                </pic:pic>
+              </a:graphicData>
+            </a:graphic>
+          </wp:inline>
+        </w:drawing>
+      </w:r>
+    </w:p>
+    <w:p>
+      <w:r>
+        <w:t xml:space="preserve">53- </w:t>
+      </w:r>
+      <w:r>
+        <w:t xml:space="preserve">Inserimos um parágrafo no </w:t>
+      </w:r>
+      <w:proofErr w:type="spellStart"/>
+      <w:r>
+        <w:t>footer</w:t>
+      </w:r>
+      <w:proofErr w:type="spellEnd"/>
+      <w:r>
+        <w:t xml:space="preserve"> e centralizamos os conteúdos dele.</w:t>
+      </w:r>
+    </w:p>
+    <w:p>
+      <w:r>
+        <w:drawing>
+          <wp:inline distT="0" distB="0" distL="0" distR="0" wp14:anchorId="4FE47166" wp14:editId="53B95931">
+            <wp:extent cx="3519427" cy="1000125"/>
+            <wp:effectExtent l="0" t="0" r="5080" b="0"/>
+            <wp:docPr id="114" name="Imagem 114"/>
+            <wp:cNvGraphicFramePr>
+              <a:graphicFrameLocks xmlns:a="http://schemas.openxmlformats.org/drawingml/2006/main" noChangeAspect="1"/>
+            </wp:cNvGraphicFramePr>
+            <a:graphic xmlns:a="http://schemas.openxmlformats.org/drawingml/2006/main">
+              <a:graphicData uri="http://schemas.openxmlformats.org/drawingml/2006/picture">
+                <pic:pic xmlns:pic="http://schemas.openxmlformats.org/drawingml/2006/picture">
+                  <pic:nvPicPr>
+                    <pic:cNvPr id="1" name=""/>
+                    <pic:cNvPicPr/>
+                  </pic:nvPicPr>
+                  <pic:blipFill>
+                    <a:blip r:embed="rId97"/>
+                    <a:stretch>
+                      <a:fillRect/>
+                    </a:stretch>
+                  </pic:blipFill>
+                  <pic:spPr>
+                    <a:xfrm>
+                      <a:off x="0" y="0"/>
+                      <a:ext cx="3524678" cy="1001617"/>
+                    </a:xfrm>
+                    <a:prstGeom prst="rect">
+                      <a:avLst/>
+                    </a:prstGeom>
+                  </pic:spPr>
+                </pic:pic>
+              </a:graphicData>
+            </a:graphic>
+          </wp:inline>
+        </w:drawing>
+      </w:r>
+      <w:r>
+        <w:drawing>
+          <wp:inline distT="0" distB="0" distL="0" distR="0" wp14:anchorId="39367607" wp14:editId="795ACA00">
+            <wp:extent cx="5515745" cy="1648055"/>
+            <wp:effectExtent l="0" t="0" r="8890" b="9525"/>
+            <wp:docPr id="116" name="Imagem 116"/>
+            <wp:cNvGraphicFramePr>
+              <a:graphicFrameLocks xmlns:a="http://schemas.openxmlformats.org/drawingml/2006/main" noChangeAspect="1"/>
+            </wp:cNvGraphicFramePr>
+            <a:graphic xmlns:a="http://schemas.openxmlformats.org/drawingml/2006/main">
+              <a:graphicData uri="http://schemas.openxmlformats.org/drawingml/2006/picture">
+                <pic:pic xmlns:pic="http://schemas.openxmlformats.org/drawingml/2006/picture">
+                  <pic:nvPicPr>
+                    <pic:cNvPr id="1" name=""/>
+                    <pic:cNvPicPr/>
+                  </pic:nvPicPr>
+                  <pic:blipFill>
+                    <a:blip r:embed="rId98"/>
+                    <a:stretch>
+                      <a:fillRect/>
+                    </a:stretch>
+                  </pic:blipFill>
+                  <pic:spPr>
+                    <a:xfrm>
+                      <a:off x="0" y="0"/>
+                      <a:ext cx="5515745" cy="1648055"/>
+                    </a:xfrm>
+                    <a:prstGeom prst="rect">
+                      <a:avLst/>
+                    </a:prstGeom>
+                  </pic:spPr>
+                </pic:pic>
+              </a:graphicData>
+            </a:graphic>
+          </wp:inline>
+        </w:drawing>
+      </w:r>
+    </w:p>
     <w:sectPr>
       <w:pgSz w:w="11906" w:h="16838"/>
       <w:pgMar w:top="1417" w:right="1701" w:bottom="1417" w:left="1701" w:header="708" w:footer="708" w:gutter="0"/>
@@ -7492,6 +7922,15 @@
 </file>
 
 <file path=customXml/item1.xml><?xml version="1.0" encoding="utf-8"?>
+<?mso-contentType ?>
+<FormTemplates xmlns="http://schemas.microsoft.com/sharepoint/v3/contenttype/forms">
+  <Display>DocumentLibraryForm</Display>
+  <Edit>DocumentLibraryForm</Edit>
+  <New>DocumentLibraryForm</New>
+</FormTemplates>
+</file>
+
+<file path=customXml/item2.xml><?xml version="1.0" encoding="utf-8"?>
 <p:properties xmlns:p="http://schemas.microsoft.com/office/2006/metadata/properties" xmlns:xsi="http://www.w3.org/2001/XMLSchema-instance" xmlns:pc="http://schemas.microsoft.com/office/infopath/2007/PartnerControls">
   <documentManagement>
     <_activity xmlns="8437a765-f0a9-40aa-978b-fcc06261281f" xsi:nil="true"/>
@@ -7499,7 +7938,7 @@
 </p:properties>
 </file>
 
-<file path=customXml/item2.xml><?xml version="1.0" encoding="utf-8"?>
+<file path=customXml/item3.xml><?xml version="1.0" encoding="utf-8"?>
 <ct:contentTypeSchema xmlns:ct="http://schemas.microsoft.com/office/2006/metadata/contentType" xmlns:ma="http://schemas.microsoft.com/office/2006/metadata/properties/metaAttributes" ct:_="" ma:_="" ma:contentTypeName="Documento" ma:contentTypeID="0x01010034B17ED9C83E394791ACA33DA9287452" ma:contentTypeVersion="16" ma:contentTypeDescription="Crie um novo documento." ma:contentTypeScope="" ma:versionID="d36ce64b1b29120840e9f9b956471cbb">
   <xsd:schema xmlns:xsd="http://www.w3.org/2001/XMLSchema" xmlns:xs="http://www.w3.org/2001/XMLSchema" xmlns:p="http://schemas.microsoft.com/office/2006/metadata/properties" xmlns:ns3="8437a765-f0a9-40aa-978b-fcc06261281f" xmlns:ns4="e78d8b06-d887-4705-9cec-751f2fb2cee2" targetNamespace="http://schemas.microsoft.com/office/2006/metadata/properties" ma:root="true" ma:fieldsID="ab1d645bb15f72c0dfc8a8f602f1de6b" ns3:_="" ns4:_="">
     <xsd:import namespace="8437a765-f0a9-40aa-978b-fcc06261281f"/>
@@ -7738,20 +8177,19 @@
 </ct:contentTypeSchema>
 </file>
 
-<file path=customXml/item3.xml><?xml version="1.0" encoding="utf-8"?>
-<?mso-contentType ?>
-<FormTemplates xmlns="http://schemas.microsoft.com/sharepoint/v3/contenttype/forms">
-  <Display>DocumentLibraryForm</Display>
-  <Edit>DocumentLibraryForm</Edit>
-  <New>DocumentLibraryForm</New>
-</FormTemplates>
-</file>
-
 <file path=customXml/item4.xml><?xml version="1.0" encoding="utf-8"?>
 <b:Sources xmlns:b="http://schemas.openxmlformats.org/officeDocument/2006/bibliography" xmlns="http://schemas.openxmlformats.org/officeDocument/2006/bibliography" SelectedStyle="\APASixthEditionOfficeOnline.xsl" StyleName="APA" Version="6"/>
 </file>
 
 <file path=customXml/itemProps1.xml><?xml version="1.0" encoding="utf-8"?>
+<ds:datastoreItem xmlns:ds="http://schemas.openxmlformats.org/officeDocument/2006/customXml" ds:itemID="{38630907-5F1E-4561-A45F-AC7CC415CD73}">
+  <ds:schemaRefs>
+    <ds:schemaRef ds:uri="http://schemas.microsoft.com/sharepoint/v3/contenttype/forms"/>
+  </ds:schemaRefs>
+</ds:datastoreItem>
+</file>
+
+<file path=customXml/itemProps2.xml><?xml version="1.0" encoding="utf-8"?>
 <ds:datastoreItem xmlns:ds="http://schemas.openxmlformats.org/officeDocument/2006/customXml" ds:itemID="{0C9FFCBC-F2CA-4FF1-AAFC-AD3B89BB1967}">
   <ds:schemaRefs>
     <ds:schemaRef ds:uri="http://schemas.microsoft.com/office/2006/metadata/properties"/>
@@ -7761,7 +8199,7 @@
 </ds:datastoreItem>
 </file>
 
-<file path=customXml/itemProps2.xml><?xml version="1.0" encoding="utf-8"?>
+<file path=customXml/itemProps3.xml><?xml version="1.0" encoding="utf-8"?>
 <ds:datastoreItem xmlns:ds="http://schemas.openxmlformats.org/officeDocument/2006/customXml" ds:itemID="{5D63F5B6-DF50-4CAF-997C-1D8B1776178E}">
   <ds:schemaRefs>
     <ds:schemaRef ds:uri="http://schemas.microsoft.com/office/2006/metadata/contentType"/>
@@ -7780,16 +8218,8 @@
 </ds:datastoreItem>
 </file>
 
-<file path=customXml/itemProps3.xml><?xml version="1.0" encoding="utf-8"?>
-<ds:datastoreItem xmlns:ds="http://schemas.openxmlformats.org/officeDocument/2006/customXml" ds:itemID="{38630907-5F1E-4561-A45F-AC7CC415CD73}">
-  <ds:schemaRefs>
-    <ds:schemaRef ds:uri="http://schemas.microsoft.com/sharepoint/v3/contenttype/forms"/>
-  </ds:schemaRefs>
-</ds:datastoreItem>
-</file>
-
 <file path=customXml/itemProps4.xml><?xml version="1.0" encoding="utf-8"?>
-<ds:datastoreItem xmlns:ds="http://schemas.openxmlformats.org/officeDocument/2006/customXml" ds:itemID="{FF02FD22-42B3-40DE-95C6-84B8ECA0F4D6}">
+<ds:datastoreItem xmlns:ds="http://schemas.openxmlformats.org/officeDocument/2006/customXml" ds:itemID="{A7FB684F-2908-4F3F-A138-C109D011580C}">
   <ds:schemaRefs>
     <ds:schemaRef ds:uri="http://schemas.openxmlformats.org/officeDocument/2006/bibliography"/>
   </ds:schemaRefs>

</xml_diff>

<commit_message>
atualização da aula dia 11/09/26
</commit_message>
<xml_diff>
--- a/apostila/Projeto Space for me3.docx
+++ b/apostila/Projeto Space for me3.docx
@@ -6035,6 +6035,9 @@
         </w:drawing>
       </w:r>
       <w:r>
+        <w:rPr>
+          <w:noProof/>
+        </w:rPr>
         <w:drawing>
           <wp:inline distT="0" distB="0" distL="0" distR="0" wp14:anchorId="5E2F44DD" wp14:editId="37A99C78">
             <wp:extent cx="4813300" cy="1962150"/>
@@ -6365,6 +6368,9 @@
     </w:p>
     <w:p>
       <w:r>
+        <w:rPr>
+          <w:noProof/>
+        </w:rPr>
         <w:drawing>
           <wp:inline distT="0" distB="0" distL="0" distR="0" wp14:anchorId="1CB33493" wp14:editId="21F4AAA5">
             <wp:extent cx="3877216" cy="485843"/>
@@ -6420,6 +6426,9 @@
     </w:p>
     <w:p>
       <w:r>
+        <w:rPr>
+          <w:noProof/>
+        </w:rPr>
         <w:drawing>
           <wp:inline distT="0" distB="0" distL="0" distR="0" wp14:anchorId="7E72A7AD" wp14:editId="0F97834C">
             <wp:extent cx="3418205" cy="1057225"/>
@@ -6459,6 +6468,9 @@
     </w:p>
     <w:p>
       <w:r>
+        <w:rPr>
+          <w:noProof/>
+        </w:rPr>
         <w:drawing>
           <wp:inline distT="0" distB="0" distL="0" distR="0" wp14:anchorId="643BEE5E" wp14:editId="6A3466E2">
             <wp:extent cx="4009202" cy="1842066"/>
@@ -6529,6 +6541,9 @@
     </w:p>
     <w:p>
       <w:r>
+        <w:rPr>
+          <w:noProof/>
+        </w:rPr>
         <w:drawing>
           <wp:inline distT="0" distB="0" distL="0" distR="0" wp14:anchorId="4C3D850A" wp14:editId="6F25B5B5">
             <wp:extent cx="1409897" cy="466790"/>
@@ -6581,6 +6596,9 @@
     </w:p>
     <w:p>
       <w:r>
+        <w:rPr>
+          <w:noProof/>
+        </w:rPr>
         <w:drawing>
           <wp:inline distT="0" distB="0" distL="0" distR="0" wp14:anchorId="7FF19277" wp14:editId="718CEB32">
             <wp:extent cx="4001058" cy="466790"/>
@@ -6630,11 +6648,12 @@
       <w:r>
         <w:t xml:space="preserve"> é branca precisamos adicionar uma cor de fundo.</w:t>
       </w:r>
-      <w:bookmarkStart w:id="0" w:name="_GoBack"/>
-      <w:bookmarkEnd w:id="0"/>
-    </w:p>
-    <w:p>
-      <w:r>
+    </w:p>
+    <w:p>
+      <w:r>
+        <w:rPr>
+          <w:noProof/>
+        </w:rPr>
         <w:drawing>
           <wp:inline distT="0" distB="0" distL="0" distR="0" wp14:anchorId="764EA872" wp14:editId="42A10E8E">
             <wp:extent cx="2448267" cy="724001"/>
@@ -6672,6 +6691,9 @@
         </w:drawing>
       </w:r>
       <w:r>
+        <w:rPr>
+          <w:noProof/>
+        </w:rPr>
         <w:drawing>
           <wp:inline distT="0" distB="0" distL="0" distR="0" wp14:anchorId="7E12A4CC" wp14:editId="089C8B31">
             <wp:extent cx="4968766" cy="1162050"/>
@@ -6727,6 +6749,9 @@
     </w:p>
     <w:p>
       <w:r>
+        <w:rPr>
+          <w:noProof/>
+        </w:rPr>
         <w:drawing>
           <wp:inline distT="0" distB="0" distL="0" distR="0" wp14:anchorId="4FE47166" wp14:editId="53B95931">
             <wp:extent cx="3519427" cy="1000125"/>
@@ -6764,6 +6789,9 @@
         </w:drawing>
       </w:r>
       <w:r>
+        <w:rPr>
+          <w:noProof/>
+        </w:rPr>
         <w:drawing>
           <wp:inline distT="0" distB="0" distL="0" distR="0" wp14:anchorId="39367607" wp14:editId="795ACA00">
             <wp:extent cx="5515745" cy="1648055"/>
@@ -6800,6 +6828,486 @@
           </wp:inline>
         </w:drawing>
       </w:r>
+    </w:p>
+    <w:p>
+      <w:r>
+        <w:rPr>
+          <w:noProof/>
+        </w:rPr>
+        <mc:AlternateContent>
+          <mc:Choice Requires="wps">
+            <w:drawing>
+              <wp:anchor distT="0" distB="0" distL="114300" distR="114300" simplePos="0" relativeHeight="251684864" behindDoc="0" locked="0" layoutInCell="1" allowOverlap="1" wp14:anchorId="0DBC3F6F" wp14:editId="10F22CCF">
+                <wp:simplePos x="0" y="0"/>
+                <wp:positionH relativeFrom="column">
+                  <wp:posOffset>2628900</wp:posOffset>
+                </wp:positionH>
+                <wp:positionV relativeFrom="paragraph">
+                  <wp:posOffset>177799</wp:posOffset>
+                </wp:positionV>
+                <wp:extent cx="3362325" cy="923925"/>
+                <wp:effectExtent l="38100" t="0" r="28575" b="66675"/>
+                <wp:wrapNone/>
+                <wp:docPr id="111" name="Conector de Seta Reta 111"/>
+                <wp:cNvGraphicFramePr/>
+                <a:graphic xmlns:a="http://schemas.openxmlformats.org/drawingml/2006/main">
+                  <a:graphicData uri="http://schemas.microsoft.com/office/word/2010/wordprocessingShape">
+                    <wps:wsp>
+                      <wps:cNvCnPr/>
+                      <wps:spPr>
+                        <a:xfrm flipH="1">
+                          <a:off x="0" y="0"/>
+                          <a:ext cx="3362325" cy="923925"/>
+                        </a:xfrm>
+                        <a:prstGeom prst="straightConnector1">
+                          <a:avLst/>
+                        </a:prstGeom>
+                        <a:ln>
+                          <a:tailEnd type="triangle"/>
+                        </a:ln>
+                      </wps:spPr>
+                      <wps:style>
+                        <a:lnRef idx="1">
+                          <a:schemeClr val="accent2"/>
+                        </a:lnRef>
+                        <a:fillRef idx="0">
+                          <a:schemeClr val="accent2"/>
+                        </a:fillRef>
+                        <a:effectRef idx="0">
+                          <a:schemeClr val="accent2"/>
+                        </a:effectRef>
+                        <a:fontRef idx="minor">
+                          <a:schemeClr val="tx1"/>
+                        </a:fontRef>
+                      </wps:style>
+                      <wps:bodyPr/>
+                    </wps:wsp>
+                  </a:graphicData>
+                </a:graphic>
+              </wp:anchor>
+            </w:drawing>
+          </mc:Choice>
+          <mc:Fallback>
+            <w:pict>
+              <v:shapetype w14:anchorId="6110F043" id="_x0000_t32" coordsize="21600,21600" o:spt="32" o:oned="t" path="m,l21600,21600e" filled="f">
+                <v:path arrowok="t" fillok="f" o:connecttype="none"/>
+                <o:lock v:ext="edit" shapetype="t"/>
+              </v:shapetype>
+              <v:shape id="Conector de Seta Reta 111" o:spid="_x0000_s1026" type="#_x0000_t32" style="position:absolute;margin-left:207pt;margin-top:14pt;width:264.75pt;height:72.75pt;flip:x;z-index:251684864;visibility:visible;mso-wrap-style:square;mso-wrap-distance-left:9pt;mso-wrap-distance-top:0;mso-wrap-distance-right:9pt;mso-wrap-distance-bottom:0;mso-position-horizontal:absolute;mso-position-horizontal-relative:text;mso-position-vertical:absolute;mso-position-vertical-relative:text" o:gfxdata="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" strokecolor="#ed7d31 [3205]" strokeweight=".5pt">
+                <v:stroke endarrow="block" joinstyle="miter"/>
+              </v:shape>
+            </w:pict>
+          </mc:Fallback>
+        </mc:AlternateContent>
+      </w:r>
+      <w:r>
+        <w:t xml:space="preserve">54- Inserindo uma imagem de fundo no site, ao contrário do </w:t>
+      </w:r>
+      <w:proofErr w:type="spellStart"/>
+      <w:r>
+        <w:t>html</w:t>
+      </w:r>
+      <w:proofErr w:type="spellEnd"/>
+      <w:r>
+        <w:t xml:space="preserve"> colocamos uma imagem de fundo pelo </w:t>
+      </w:r>
+      <w:proofErr w:type="spellStart"/>
+      <w:r>
+        <w:t>css</w:t>
+      </w:r>
+      <w:proofErr w:type="spellEnd"/>
+      <w:r>
+        <w:t xml:space="preserve"> e quando realizamos tal função a natureza da imagem e ficar se repetindo no site.</w:t>
+      </w:r>
+    </w:p>
+    <w:p>
+      <w:r>
+        <w:t>Se não quiséssemos que isso aconteça precisamos adicionar o comando.</w:t>
+      </w:r>
+    </w:p>
+    <w:p>
+      <w:r>
+        <w:rPr>
+          <w:noProof/>
+        </w:rPr>
+        <mc:AlternateContent>
+          <mc:Choice Requires="wps">
+            <w:drawing>
+              <wp:anchor distT="0" distB="0" distL="114300" distR="114300" simplePos="0" relativeHeight="251685888" behindDoc="0" locked="0" layoutInCell="1" allowOverlap="1" wp14:anchorId="30D8B587" wp14:editId="1C764822">
+                <wp:simplePos x="0" y="0"/>
+                <wp:positionH relativeFrom="column">
+                  <wp:posOffset>2247900</wp:posOffset>
+                </wp:positionH>
+                <wp:positionV relativeFrom="paragraph">
+                  <wp:posOffset>681355</wp:posOffset>
+                </wp:positionV>
+                <wp:extent cx="990600" cy="57150"/>
+                <wp:effectExtent l="0" t="19050" r="76200" b="95250"/>
+                <wp:wrapNone/>
+                <wp:docPr id="117" name="Conector de Seta Reta 117"/>
+                <wp:cNvGraphicFramePr/>
+                <a:graphic xmlns:a="http://schemas.openxmlformats.org/drawingml/2006/main">
+                  <a:graphicData uri="http://schemas.microsoft.com/office/word/2010/wordprocessingShape">
+                    <wps:wsp>
+                      <wps:cNvCnPr/>
+                      <wps:spPr>
+                        <a:xfrm>
+                          <a:off x="0" y="0"/>
+                          <a:ext cx="990600" cy="57150"/>
+                        </a:xfrm>
+                        <a:prstGeom prst="straightConnector1">
+                          <a:avLst/>
+                        </a:prstGeom>
+                        <a:ln>
+                          <a:tailEnd type="triangle"/>
+                        </a:ln>
+                      </wps:spPr>
+                      <wps:style>
+                        <a:lnRef idx="1">
+                          <a:schemeClr val="accent2"/>
+                        </a:lnRef>
+                        <a:fillRef idx="0">
+                          <a:schemeClr val="accent2"/>
+                        </a:fillRef>
+                        <a:effectRef idx="0">
+                          <a:schemeClr val="accent2"/>
+                        </a:effectRef>
+                        <a:fontRef idx="minor">
+                          <a:schemeClr val="tx1"/>
+                        </a:fontRef>
+                      </wps:style>
+                      <wps:bodyPr/>
+                    </wps:wsp>
+                  </a:graphicData>
+                </a:graphic>
+              </wp:anchor>
+            </w:drawing>
+          </mc:Choice>
+          <mc:Fallback>
+            <w:pict>
+              <v:shape w14:anchorId="3D9ED6E9" id="Conector de Seta Reta 117" o:spid="_x0000_s1026" type="#_x0000_t32" style="position:absolute;margin-left:177pt;margin-top:53.65pt;width:78pt;height:4.5pt;z-index:251685888;visibility:visible;mso-wrap-style:square;mso-wrap-distance-left:9pt;mso-wrap-distance-top:0;mso-wrap-distance-right:9pt;mso-wrap-distance-bottom:0;mso-position-horizontal:absolute;mso-position-horizontal-relative:text;mso-position-vertical:absolute;mso-position-vertical-relative:text" o:gfxdata="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" strokecolor="#ed7d31 [3205]" strokeweight=".5pt">
+                <v:stroke endarrow="block" joinstyle="miter"/>
+              </v:shape>
+            </w:pict>
+          </mc:Fallback>
+        </mc:AlternateContent>
+      </w:r>
+      <w:r>
+        <w:rPr>
+          <w:noProof/>
+        </w:rPr>
+        <mc:AlternateContent>
+          <mc:Choice Requires="wps">
+            <w:drawing>
+              <wp:anchor distT="0" distB="0" distL="114300" distR="114300" simplePos="0" relativeHeight="251683840" behindDoc="0" locked="0" layoutInCell="1" allowOverlap="1" wp14:anchorId="664B4ACE" wp14:editId="4BF3DDA0">
+                <wp:simplePos x="0" y="0"/>
+                <wp:positionH relativeFrom="column">
+                  <wp:posOffset>76200</wp:posOffset>
+                </wp:positionH>
+                <wp:positionV relativeFrom="paragraph">
+                  <wp:posOffset>-137795</wp:posOffset>
+                </wp:positionV>
+                <wp:extent cx="209550" cy="771525"/>
+                <wp:effectExtent l="0" t="0" r="57150" b="47625"/>
+                <wp:wrapNone/>
+                <wp:docPr id="105" name="Conector de Seta Reta 105"/>
+                <wp:cNvGraphicFramePr/>
+                <a:graphic xmlns:a="http://schemas.openxmlformats.org/drawingml/2006/main">
+                  <a:graphicData uri="http://schemas.microsoft.com/office/word/2010/wordprocessingShape">
+                    <wps:wsp>
+                      <wps:cNvCnPr/>
+                      <wps:spPr>
+                        <a:xfrm>
+                          <a:off x="0" y="0"/>
+                          <a:ext cx="209550" cy="771525"/>
+                        </a:xfrm>
+                        <a:prstGeom prst="straightConnector1">
+                          <a:avLst/>
+                        </a:prstGeom>
+                        <a:ln>
+                          <a:tailEnd type="triangle"/>
+                        </a:ln>
+                      </wps:spPr>
+                      <wps:style>
+                        <a:lnRef idx="1">
+                          <a:schemeClr val="accent2"/>
+                        </a:lnRef>
+                        <a:fillRef idx="0">
+                          <a:schemeClr val="accent2"/>
+                        </a:fillRef>
+                        <a:effectRef idx="0">
+                          <a:schemeClr val="accent2"/>
+                        </a:effectRef>
+                        <a:fontRef idx="minor">
+                          <a:schemeClr val="tx1"/>
+                        </a:fontRef>
+                      </wps:style>
+                      <wps:bodyPr/>
+                    </wps:wsp>
+                  </a:graphicData>
+                </a:graphic>
+                <wp14:sizeRelH relativeFrom="margin">
+                  <wp14:pctWidth>0</wp14:pctWidth>
+                </wp14:sizeRelH>
+                <wp14:sizeRelV relativeFrom="margin">
+                  <wp14:pctHeight>0</wp14:pctHeight>
+                </wp14:sizeRelV>
+              </wp:anchor>
+            </w:drawing>
+          </mc:Choice>
+          <mc:Fallback>
+            <w:pict>
+              <v:shape w14:anchorId="69736B94" id="Conector de Seta Reta 105" o:spid="_x0000_s1026" type="#_x0000_t32" style="position:absolute;margin-left:6pt;margin-top:-10.85pt;width:16.5pt;height:60.75pt;z-index:251683840;visibility:visible;mso-wrap-style:square;mso-width-percent:0;mso-height-percent:0;mso-wrap-distance-left:9pt;mso-wrap-distance-top:0;mso-wrap-distance-right:9pt;mso-wrap-distance-bottom:0;mso-position-horizontal:absolute;mso-position-horizontal-relative:text;mso-position-vertical:absolute;mso-position-vertical-relative:text;mso-width-percent:0;mso-height-percent:0;mso-width-relative:margin;mso-height-relative:margin" o:gfxdata="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" strokecolor="#ed7d31 [3205]" strokeweight=".5pt">
+                <v:stroke endarrow="block" joinstyle="miter"/>
+              </v:shape>
+            </w:pict>
+          </mc:Fallback>
+        </mc:AlternateContent>
+      </w:r>
+      <w:r>
+        <w:t xml:space="preserve"> </w:t>
+      </w:r>
+      <w:r>
+        <w:drawing>
+          <wp:inline distT="0" distB="0" distL="0" distR="0" wp14:anchorId="22A80C32" wp14:editId="23E8A372">
+            <wp:extent cx="3238952" cy="1019317"/>
+            <wp:effectExtent l="0" t="0" r="0" b="9525"/>
+            <wp:docPr id="99" name="Imagem 99"/>
+            <wp:cNvGraphicFramePr>
+              <a:graphicFrameLocks xmlns:a="http://schemas.openxmlformats.org/drawingml/2006/main" noChangeAspect="1"/>
+            </wp:cNvGraphicFramePr>
+            <a:graphic xmlns:a="http://schemas.openxmlformats.org/drawingml/2006/main">
+              <a:graphicData uri="http://schemas.openxmlformats.org/drawingml/2006/picture">
+                <pic:pic xmlns:pic="http://schemas.openxmlformats.org/drawingml/2006/picture">
+                  <pic:nvPicPr>
+                    <pic:cNvPr id="1" name=""/>
+                    <pic:cNvPicPr/>
+                  </pic:nvPicPr>
+                  <pic:blipFill>
+                    <a:blip r:embed="rId99"/>
+                    <a:stretch>
+                      <a:fillRect/>
+                    </a:stretch>
+                  </pic:blipFill>
+                  <pic:spPr>
+                    <a:xfrm>
+                      <a:off x="0" y="0"/>
+                      <a:ext cx="3238952" cy="1019317"/>
+                    </a:xfrm>
+                    <a:prstGeom prst="rect">
+                      <a:avLst/>
+                    </a:prstGeom>
+                  </pic:spPr>
+                </pic:pic>
+              </a:graphicData>
+            </a:graphic>
+          </wp:inline>
+        </w:drawing>
+      </w:r>
+      <w:r>
+        <w:drawing>
+          <wp:inline distT="0" distB="0" distL="0" distR="0" wp14:anchorId="19DC10A2" wp14:editId="78024E4C">
+            <wp:extent cx="7817376" cy="1047750"/>
+            <wp:effectExtent l="0" t="0" r="0" b="0"/>
+            <wp:docPr id="108" name="Imagem 108"/>
+            <wp:cNvGraphicFramePr>
+              <a:graphicFrameLocks xmlns:a="http://schemas.openxmlformats.org/drawingml/2006/main" noChangeAspect="1"/>
+            </wp:cNvGraphicFramePr>
+            <a:graphic xmlns:a="http://schemas.openxmlformats.org/drawingml/2006/main">
+              <a:graphicData uri="http://schemas.openxmlformats.org/drawingml/2006/picture">
+                <pic:pic xmlns:pic="http://schemas.openxmlformats.org/drawingml/2006/picture">
+                  <pic:nvPicPr>
+                    <pic:cNvPr id="1" name=""/>
+                    <pic:cNvPicPr/>
+                  </pic:nvPicPr>
+                  <pic:blipFill>
+                    <a:blip r:embed="rId100"/>
+                    <a:stretch>
+                      <a:fillRect/>
+                    </a:stretch>
+                  </pic:blipFill>
+                  <pic:spPr>
+                    <a:xfrm>
+                      <a:off x="0" y="0"/>
+                      <a:ext cx="8409877" cy="1127162"/>
+                    </a:xfrm>
+                    <a:prstGeom prst="rect">
+                      <a:avLst/>
+                    </a:prstGeom>
+                  </pic:spPr>
+                </pic:pic>
+              </a:graphicData>
+            </a:graphic>
+          </wp:inline>
+        </w:drawing>
+      </w:r>
+    </w:p>
+    <w:p>
+      <w:r>
+        <w:t>55-</w:t>
+      </w:r>
+      <w:r>
+        <w:t xml:space="preserve">No </w:t>
+      </w:r>
+      <w:proofErr w:type="spellStart"/>
+      <w:r>
+        <w:t>footer</w:t>
+      </w:r>
+      <w:proofErr w:type="spellEnd"/>
+      <w:r>
+        <w:t xml:space="preserve"> após colocarmos uma imagem de fundo preta, se fez necessário mudar a cor da letra do parágrafo (White).</w:t>
+      </w:r>
+    </w:p>
+    <w:p>
+      <w:r>
+        <w:t xml:space="preserve"> Aumentamos o espaço interno tanto para cima como para baixo e diminuímos o tamanho da fonte.</w:t>
+      </w:r>
+    </w:p>
+    <w:p>
+      <w:r>
+        <w:drawing>
+          <wp:inline distT="0" distB="0" distL="0" distR="0" wp14:anchorId="271D0923" wp14:editId="1FF45A8F">
+            <wp:extent cx="3334215" cy="1219370"/>
+            <wp:effectExtent l="0" t="0" r="0" b="0"/>
+            <wp:docPr id="118" name="Imagem 118"/>
+            <wp:cNvGraphicFramePr>
+              <a:graphicFrameLocks xmlns:a="http://schemas.openxmlformats.org/drawingml/2006/main" noChangeAspect="1"/>
+            </wp:cNvGraphicFramePr>
+            <a:graphic xmlns:a="http://schemas.openxmlformats.org/drawingml/2006/main">
+              <a:graphicData uri="http://schemas.openxmlformats.org/drawingml/2006/picture">
+                <pic:pic xmlns:pic="http://schemas.openxmlformats.org/drawingml/2006/picture">
+                  <pic:nvPicPr>
+                    <pic:cNvPr id="1" name=""/>
+                    <pic:cNvPicPr/>
+                  </pic:nvPicPr>
+                  <pic:blipFill>
+                    <a:blip r:embed="rId101"/>
+                    <a:stretch>
+                      <a:fillRect/>
+                    </a:stretch>
+                  </pic:blipFill>
+                  <pic:spPr>
+                    <a:xfrm>
+                      <a:off x="0" y="0"/>
+                      <a:ext cx="3334215" cy="1219370"/>
+                    </a:xfrm>
+                    <a:prstGeom prst="rect">
+                      <a:avLst/>
+                    </a:prstGeom>
+                  </pic:spPr>
+                </pic:pic>
+              </a:graphicData>
+            </a:graphic>
+          </wp:inline>
+        </w:drawing>
+      </w:r>
+    </w:p>
+    <w:p>
+      <w:r>
+        <w:t xml:space="preserve">56 </w:t>
+      </w:r>
+      <w:r>
+        <w:t>–</w:t>
+      </w:r>
+      <w:r>
+        <w:t xml:space="preserve"> </w:t>
+      </w:r>
+      <w:r>
+        <w:t xml:space="preserve">Criamos a página contatos.html e contatos.css, copiamos o cabeçalho(header) da página produtos e colocamos na página contato e repetimos o mesmo processo do </w:t>
+      </w:r>
+      <w:proofErr w:type="spellStart"/>
+      <w:r>
+        <w:t>css</w:t>
+      </w:r>
+      <w:proofErr w:type="spellEnd"/>
+      <w:r>
+        <w:t>, com isso finalizamos o menu que já estava pronto.</w:t>
+      </w:r>
+    </w:p>
+    <w:p>
+      <w:r>
+        <w:drawing>
+          <wp:inline distT="0" distB="0" distL="0" distR="0" wp14:anchorId="183AA717" wp14:editId="128DC822">
+            <wp:extent cx="7658710" cy="2667000"/>
+            <wp:effectExtent l="0" t="0" r="0" b="0"/>
+            <wp:docPr id="119" name="Imagem 119"/>
+            <wp:cNvGraphicFramePr>
+              <a:graphicFrameLocks xmlns:a="http://schemas.openxmlformats.org/drawingml/2006/main" noChangeAspect="1"/>
+            </wp:cNvGraphicFramePr>
+            <a:graphic xmlns:a="http://schemas.openxmlformats.org/drawingml/2006/main">
+              <a:graphicData uri="http://schemas.openxmlformats.org/drawingml/2006/picture">
+                <pic:pic xmlns:pic="http://schemas.openxmlformats.org/drawingml/2006/picture">
+                  <pic:nvPicPr>
+                    <pic:cNvPr id="1" name=""/>
+                    <pic:cNvPicPr/>
+                  </pic:nvPicPr>
+                  <pic:blipFill>
+                    <a:blip r:embed="rId102"/>
+                    <a:stretch>
+                      <a:fillRect/>
+                    </a:stretch>
+                  </pic:blipFill>
+                  <pic:spPr>
+                    <a:xfrm>
+                      <a:off x="0" y="0"/>
+                      <a:ext cx="7677204" cy="2673440"/>
+                    </a:xfrm>
+                    <a:prstGeom prst="rect">
+                      <a:avLst/>
+                    </a:prstGeom>
+                  </pic:spPr>
+                </pic:pic>
+              </a:graphicData>
+            </a:graphic>
+          </wp:inline>
+        </w:drawing>
+      </w:r>
+    </w:p>
+    <w:p>
+      <w:r>
+        <w:drawing>
+          <wp:inline distT="0" distB="0" distL="0" distR="0" wp14:anchorId="6D284468" wp14:editId="3CD54AE2">
+            <wp:extent cx="2826758" cy="3381375"/>
+            <wp:effectExtent l="0" t="0" r="0" b="0"/>
+            <wp:docPr id="120" name="Imagem 120"/>
+            <wp:cNvGraphicFramePr>
+              <a:graphicFrameLocks xmlns:a="http://schemas.openxmlformats.org/drawingml/2006/main" noChangeAspect="1"/>
+            </wp:cNvGraphicFramePr>
+            <a:graphic xmlns:a="http://schemas.openxmlformats.org/drawingml/2006/main">
+              <a:graphicData uri="http://schemas.openxmlformats.org/drawingml/2006/picture">
+                <pic:pic xmlns:pic="http://schemas.openxmlformats.org/drawingml/2006/picture">
+                  <pic:nvPicPr>
+                    <pic:cNvPr id="1" name=""/>
+                    <pic:cNvPicPr/>
+                  </pic:nvPicPr>
+                  <pic:blipFill>
+                    <a:blip r:embed="rId103"/>
+                    <a:stretch>
+                      <a:fillRect/>
+                    </a:stretch>
+                  </pic:blipFill>
+                  <pic:spPr>
+                    <a:xfrm>
+                      <a:off x="0" y="0"/>
+                      <a:ext cx="2843191" cy="3401032"/>
+                    </a:xfrm>
+                    <a:prstGeom prst="rect">
+                      <a:avLst/>
+                    </a:prstGeom>
+                  </pic:spPr>
+                </pic:pic>
+              </a:graphicData>
+            </a:graphic>
+          </wp:inline>
+        </w:drawing>
+      </w:r>
+    </w:p>
+    <w:p>
+      <w:r>
+        <w:t xml:space="preserve">57 - </w:t>
+      </w:r>
+      <w:bookmarkStart w:id="0" w:name="_GoBack"/>
+      <w:bookmarkEnd w:id="0"/>
     </w:p>
     <w:sectPr>
       <w:pgSz w:w="11906" w:h="16838"/>
@@ -7922,23 +8430,6 @@
 </file>
 
 <file path=customXml/item1.xml><?xml version="1.0" encoding="utf-8"?>
-<?mso-contentType ?>
-<FormTemplates xmlns="http://schemas.microsoft.com/sharepoint/v3/contenttype/forms">
-  <Display>DocumentLibraryForm</Display>
-  <Edit>DocumentLibraryForm</Edit>
-  <New>DocumentLibraryForm</New>
-</FormTemplates>
-</file>
-
-<file path=customXml/item2.xml><?xml version="1.0" encoding="utf-8"?>
-<p:properties xmlns:p="http://schemas.microsoft.com/office/2006/metadata/properties" xmlns:xsi="http://www.w3.org/2001/XMLSchema-instance" xmlns:pc="http://schemas.microsoft.com/office/infopath/2007/PartnerControls">
-  <documentManagement>
-    <_activity xmlns="8437a765-f0a9-40aa-978b-fcc06261281f" xsi:nil="true"/>
-  </documentManagement>
-</p:properties>
-</file>
-
-<file path=customXml/item3.xml><?xml version="1.0" encoding="utf-8"?>
 <ct:contentTypeSchema xmlns:ct="http://schemas.microsoft.com/office/2006/metadata/contentType" xmlns:ma="http://schemas.microsoft.com/office/2006/metadata/properties/metaAttributes" ct:_="" ma:_="" ma:contentTypeName="Documento" ma:contentTypeID="0x01010034B17ED9C83E394791ACA33DA9287452" ma:contentTypeVersion="16" ma:contentTypeDescription="Crie um novo documento." ma:contentTypeScope="" ma:versionID="d36ce64b1b29120840e9f9b956471cbb">
   <xsd:schema xmlns:xsd="http://www.w3.org/2001/XMLSchema" xmlns:xs="http://www.w3.org/2001/XMLSchema" xmlns:p="http://schemas.microsoft.com/office/2006/metadata/properties" xmlns:ns3="8437a765-f0a9-40aa-978b-fcc06261281f" xmlns:ns4="e78d8b06-d887-4705-9cec-751f2fb2cee2" targetNamespace="http://schemas.microsoft.com/office/2006/metadata/properties" ma:root="true" ma:fieldsID="ab1d645bb15f72c0dfc8a8f602f1de6b" ns3:_="" ns4:_="">
     <xsd:import namespace="8437a765-f0a9-40aa-978b-fcc06261281f"/>
@@ -8177,29 +8668,28 @@
 </ct:contentTypeSchema>
 </file>
 
+<file path=customXml/item2.xml><?xml version="1.0" encoding="utf-8"?>
+<?mso-contentType ?>
+<FormTemplates xmlns="http://schemas.microsoft.com/sharepoint/v3/contenttype/forms">
+  <Display>DocumentLibraryForm</Display>
+  <Edit>DocumentLibraryForm</Edit>
+  <New>DocumentLibraryForm</New>
+</FormTemplates>
+</file>
+
+<file path=customXml/item3.xml><?xml version="1.0" encoding="utf-8"?>
+<p:properties xmlns:p="http://schemas.microsoft.com/office/2006/metadata/properties" xmlns:xsi="http://www.w3.org/2001/XMLSchema-instance" xmlns:pc="http://schemas.microsoft.com/office/infopath/2007/PartnerControls">
+  <documentManagement>
+    <_activity xmlns="8437a765-f0a9-40aa-978b-fcc06261281f" xsi:nil="true"/>
+  </documentManagement>
+</p:properties>
+</file>
+
 <file path=customXml/item4.xml><?xml version="1.0" encoding="utf-8"?>
 <b:Sources xmlns:b="http://schemas.openxmlformats.org/officeDocument/2006/bibliography" xmlns="http://schemas.openxmlformats.org/officeDocument/2006/bibliography" SelectedStyle="\APASixthEditionOfficeOnline.xsl" StyleName="APA" Version="6"/>
 </file>
 
 <file path=customXml/itemProps1.xml><?xml version="1.0" encoding="utf-8"?>
-<ds:datastoreItem xmlns:ds="http://schemas.openxmlformats.org/officeDocument/2006/customXml" ds:itemID="{38630907-5F1E-4561-A45F-AC7CC415CD73}">
-  <ds:schemaRefs>
-    <ds:schemaRef ds:uri="http://schemas.microsoft.com/sharepoint/v3/contenttype/forms"/>
-  </ds:schemaRefs>
-</ds:datastoreItem>
-</file>
-
-<file path=customXml/itemProps2.xml><?xml version="1.0" encoding="utf-8"?>
-<ds:datastoreItem xmlns:ds="http://schemas.openxmlformats.org/officeDocument/2006/customXml" ds:itemID="{0C9FFCBC-F2CA-4FF1-AAFC-AD3B89BB1967}">
-  <ds:schemaRefs>
-    <ds:schemaRef ds:uri="http://schemas.microsoft.com/office/2006/metadata/properties"/>
-    <ds:schemaRef ds:uri="http://schemas.microsoft.com/office/infopath/2007/PartnerControls"/>
-    <ds:schemaRef ds:uri="8437a765-f0a9-40aa-978b-fcc06261281f"/>
-  </ds:schemaRefs>
-</ds:datastoreItem>
-</file>
-
-<file path=customXml/itemProps3.xml><?xml version="1.0" encoding="utf-8"?>
 <ds:datastoreItem xmlns:ds="http://schemas.openxmlformats.org/officeDocument/2006/customXml" ds:itemID="{5D63F5B6-DF50-4CAF-997C-1D8B1776178E}">
   <ds:schemaRefs>
     <ds:schemaRef ds:uri="http://schemas.microsoft.com/office/2006/metadata/contentType"/>
@@ -8218,8 +8708,26 @@
 </ds:datastoreItem>
 </file>
 
+<file path=customXml/itemProps2.xml><?xml version="1.0" encoding="utf-8"?>
+<ds:datastoreItem xmlns:ds="http://schemas.openxmlformats.org/officeDocument/2006/customXml" ds:itemID="{38630907-5F1E-4561-A45F-AC7CC415CD73}">
+  <ds:schemaRefs>
+    <ds:schemaRef ds:uri="http://schemas.microsoft.com/sharepoint/v3/contenttype/forms"/>
+  </ds:schemaRefs>
+</ds:datastoreItem>
+</file>
+
+<file path=customXml/itemProps3.xml><?xml version="1.0" encoding="utf-8"?>
+<ds:datastoreItem xmlns:ds="http://schemas.openxmlformats.org/officeDocument/2006/customXml" ds:itemID="{0C9FFCBC-F2CA-4FF1-AAFC-AD3B89BB1967}">
+  <ds:schemaRefs>
+    <ds:schemaRef ds:uri="http://schemas.microsoft.com/office/2006/metadata/properties"/>
+    <ds:schemaRef ds:uri="http://schemas.microsoft.com/office/infopath/2007/PartnerControls"/>
+    <ds:schemaRef ds:uri="8437a765-f0a9-40aa-978b-fcc06261281f"/>
+  </ds:schemaRefs>
+</ds:datastoreItem>
+</file>
+
 <file path=customXml/itemProps4.xml><?xml version="1.0" encoding="utf-8"?>
-<ds:datastoreItem xmlns:ds="http://schemas.openxmlformats.org/officeDocument/2006/customXml" ds:itemID="{A7FB684F-2908-4F3F-A138-C109D011580C}">
+<ds:datastoreItem xmlns:ds="http://schemas.openxmlformats.org/officeDocument/2006/customXml" ds:itemID="{EA68B348-F268-413E-8107-EED6BA5EF810}">
   <ds:schemaRefs>
     <ds:schemaRef ds:uri="http://schemas.openxmlformats.org/officeDocument/2006/bibliography"/>
   </ds:schemaRefs>

</xml_diff>